<commit_message>
fixes and VF commit
</commit_message>
<xml_diff>
--- a/Part_A_Ukraine_Monetary_Regime.docx
+++ b/Part_A_Ukraine_Monetary_Regime.docx
@@ -6,6 +6,9 @@
       <w:pPr>
         <w:spacing w:after="80"/>
         <w:jc w:val="center"/>
+        <w:rPr>
+          <w:lang w:val="en-GB"/>
+        </w:rPr>
       </w:pPr>
       <w:r>
         <w:rPr>
@@ -14,6 +17,7 @@
           <w:color w:val="2E5090"/>
           <w:sz w:val="36"/>
           <w:szCs w:val="36"/>
+          <w:lang w:val="en-GB"/>
         </w:rPr>
         <w:t>Part A</w:t>
       </w:r>
@@ -22,6 +26,9 @@
       <w:pPr>
         <w:spacing w:after="80"/>
         <w:jc w:val="center"/>
+        <w:rPr>
+          <w:lang w:val="en-GB"/>
+        </w:rPr>
       </w:pPr>
       <w:r>
         <w:rPr>
@@ -29,6 +36,7 @@
           <w:bCs/>
           <w:sz w:val="28"/>
           <w:szCs w:val="28"/>
+          <w:lang w:val="en-GB"/>
         </w:rPr>
         <w:t>Ukraine’s Monetary Regime: A Documented Chronology (2000–2025)</w:t>
       </w:r>
@@ -37,67 +45,64 @@
       <w:pPr>
         <w:spacing w:after="400"/>
         <w:jc w:val="center"/>
+        <w:rPr>
+          <w:lang w:val="en-GB"/>
+        </w:rPr>
       </w:pPr>
       <w:r>
         <w:rPr>
           <w:i/>
           <w:iCs/>
           <w:color w:val="666666"/>
-        </w:rPr>
-        <w:t>Eduardo Medina Schutt</w:t>
-      </w:r>
-      <w:r>
-        <w:rPr>
-          <w:i/>
-          <w:iCs/>
-          <w:color w:val="666666"/>
-        </w:rPr>
-        <w:t xml:space="preserve"> — </w:t>
-      </w:r>
-      <w:r>
-        <w:rPr>
-          <w:i/>
-          <w:iCs/>
-          <w:color w:val="666666"/>
-        </w:rPr>
-        <w:t>Final Exam of</w:t>
-      </w:r>
-      <w:r>
-        <w:rPr>
-          <w:i/>
-          <w:iCs/>
-          <w:color w:val="666666"/>
-        </w:rPr>
-        <w:t xml:space="preserve"> Quantitative Methods in Finance</w:t>
+          <w:lang w:val="en-GB"/>
+        </w:rPr>
+        <w:t>Eduardo Medina Schutt — Final Exam of Quantitative Methods in Finance</w:t>
       </w:r>
     </w:p>
     <w:p>
       <w:pPr>
         <w:pStyle w:val="Ttulo1"/>
+        <w:rPr>
+          <w:lang w:val="en-GB"/>
+        </w:rPr>
       </w:pPr>
       <w:r>
+        <w:rPr>
+          <w:lang w:val="en-GB"/>
+        </w:rPr>
         <w:t>1. Summary Table: NBU Exchange Rate Regime</w:t>
       </w:r>
     </w:p>
     <w:p>
       <w:pPr>
         <w:spacing w:after="200"/>
+        <w:rPr>
+          <w:lang w:val="en-GB"/>
+        </w:rPr>
       </w:pPr>
       <w:r>
+        <w:rPr>
+          <w:lang w:val="en-GB"/>
+        </w:rPr>
         <w:t>Table 1 documents the eight distinct regime periods identified for the NBU between 2000 and 2025, drawing on IMF AREAER classifications</w:t>
       </w:r>
       <w:r>
         <w:rPr>
           <w:rStyle w:val="Refdenotaderodap"/>
+          <w:lang w:val="en-GB"/>
         </w:rPr>
         <w:footnoteReference w:id="1"/>
       </w:r>
       <w:r>
+        <w:rPr>
+          <w:lang w:val="en-GB"/>
+        </w:rPr>
         <w:t>, NBU official communications, and the academic literature.</w:t>
       </w:r>
       <w:r>
         <w:rPr>
           <w:rStyle w:val="Refdenotaderodap"/>
+          <w:lang w:val="en-GB"/>
         </w:rPr>
         <w:footnoteReference w:id="2"/>
       </w:r>
@@ -128,12 +133,6 @@
         <w:gridCol w:w="1400"/>
       </w:tblGrid>
       <w:tr>
-        <w:tblPrEx>
-          <w:tblCellMar>
-            <w:top w:w="0" w:type="dxa"/>
-            <w:bottom w:w="0" w:type="dxa"/>
-          </w:tblCellMar>
-        </w:tblPrEx>
         <w:trPr>
           <w:tblHeader/>
         </w:trPr>
@@ -158,6 +157,9 @@
           <w:p>
             <w:pPr>
               <w:jc w:val="center"/>
+              <w:rPr>
+                <w:lang w:val="en-GB"/>
+              </w:rPr>
             </w:pPr>
             <w:r>
               <w:rPr>
@@ -166,6 +168,7 @@
                 <w:color w:val="FFFFFF"/>
                 <w:sz w:val="18"/>
                 <w:szCs w:val="18"/>
+                <w:lang w:val="en-GB"/>
               </w:rPr>
               <w:t>Period</w:t>
             </w:r>
@@ -192,6 +195,9 @@
           <w:p>
             <w:pPr>
               <w:jc w:val="center"/>
+              <w:rPr>
+                <w:lang w:val="en-GB"/>
+              </w:rPr>
             </w:pPr>
             <w:r>
               <w:rPr>
@@ -200,6 +206,7 @@
                 <w:color w:val="FFFFFF"/>
                 <w:sz w:val="18"/>
                 <w:szCs w:val="18"/>
+                <w:lang w:val="en-GB"/>
               </w:rPr>
               <w:t>Dates</w:t>
             </w:r>
@@ -226,6 +233,9 @@
           <w:p>
             <w:pPr>
               <w:jc w:val="center"/>
+              <w:rPr>
+                <w:lang w:val="en-GB"/>
+              </w:rPr>
             </w:pPr>
             <w:r>
               <w:rPr>
@@ -234,6 +244,7 @@
                 <w:color w:val="FFFFFF"/>
                 <w:sz w:val="18"/>
                 <w:szCs w:val="18"/>
+                <w:lang w:val="en-GB"/>
               </w:rPr>
               <w:t>UAH/USD</w:t>
             </w:r>
@@ -260,6 +271,9 @@
           <w:p>
             <w:pPr>
               <w:jc w:val="center"/>
+              <w:rPr>
+                <w:lang w:val="en-GB"/>
+              </w:rPr>
             </w:pPr>
             <w:r>
               <w:rPr>
@@ -268,6 +282,7 @@
                 <w:color w:val="FFFFFF"/>
                 <w:sz w:val="18"/>
                 <w:szCs w:val="18"/>
+                <w:lang w:val="en-GB"/>
               </w:rPr>
               <w:t>De Facto Regime (IMF)</w:t>
             </w:r>
@@ -294,6 +309,9 @@
           <w:p>
             <w:pPr>
               <w:jc w:val="center"/>
+              <w:rPr>
+                <w:lang w:val="en-GB"/>
+              </w:rPr>
             </w:pPr>
             <w:r>
               <w:rPr>
@@ -302,6 +320,7 @@
                 <w:color w:val="FFFFFF"/>
                 <w:sz w:val="18"/>
                 <w:szCs w:val="18"/>
+                <w:lang w:val="en-GB"/>
               </w:rPr>
               <w:t>Key Events &amp; Triggers</w:t>
             </w:r>
@@ -328,6 +347,9 @@
           <w:p>
             <w:pPr>
               <w:jc w:val="center"/>
+              <w:rPr>
+                <w:lang w:val="en-GB"/>
+              </w:rPr>
             </w:pPr>
             <w:r>
               <w:rPr>
@@ -336,6 +358,7 @@
                 <w:color w:val="FFFFFF"/>
                 <w:sz w:val="18"/>
                 <w:szCs w:val="18"/>
+                <w:lang w:val="en-GB"/>
               </w:rPr>
               <w:t>Capital Controls</w:t>
             </w:r>
@@ -343,12 +366,6 @@
         </w:tc>
       </w:tr>
       <w:tr>
-        <w:tblPrEx>
-          <w:tblCellMar>
-            <w:top w:w="0" w:type="dxa"/>
-            <w:bottom w:w="0" w:type="dxa"/>
-          </w:tblCellMar>
-        </w:tblPrEx>
         <w:tc>
           <w:tcPr>
             <w:tcW w:w="900" w:type="dxa"/>
@@ -368,11 +385,15 @@
           <w:p>
             <w:pPr>
               <w:spacing w:before="20" w:after="20"/>
+              <w:rPr>
+                <w:lang w:val="en-GB"/>
+              </w:rPr>
             </w:pPr>
             <w:r>
               <w:rPr>
                 <w:sz w:val="17"/>
                 <w:szCs w:val="17"/>
+                <w:lang w:val="en-GB"/>
               </w:rPr>
               <w:t>1</w:t>
             </w:r>
@@ -397,11 +418,15 @@
           <w:p>
             <w:pPr>
               <w:spacing w:before="20" w:after="20"/>
+              <w:rPr>
+                <w:lang w:val="en-GB"/>
+              </w:rPr>
             </w:pPr>
             <w:r>
               <w:rPr>
                 <w:sz w:val="17"/>
                 <w:szCs w:val="17"/>
+                <w:lang w:val="en-GB"/>
               </w:rPr>
               <w:t>2000 – Apr 2005</w:t>
             </w:r>
@@ -426,11 +451,15 @@
           <w:p>
             <w:pPr>
               <w:spacing w:before="20" w:after="20"/>
+              <w:rPr>
+                <w:lang w:val="en-GB"/>
+              </w:rPr>
             </w:pPr>
             <w:r>
               <w:rPr>
                 <w:sz w:val="17"/>
                 <w:szCs w:val="17"/>
+                <w:lang w:val="en-GB"/>
               </w:rPr>
               <w:t>≈5.4–5.6</w:t>
             </w:r>
@@ -455,6 +484,9 @@
           <w:p>
             <w:pPr>
               <w:spacing w:before="20" w:after="20"/>
+              <w:rPr>
+                <w:lang w:val="en-GB"/>
+              </w:rPr>
             </w:pPr>
             <w:r>
               <w:rPr>
@@ -462,6 +494,7 @@
                 <w:iCs/>
                 <w:sz w:val="17"/>
                 <w:szCs w:val="17"/>
+                <w:lang w:val="en-GB"/>
               </w:rPr>
               <w:t>De facto peg to USD</w:t>
             </w:r>
@@ -486,11 +519,15 @@
           <w:p>
             <w:pPr>
               <w:spacing w:before="20" w:after="20"/>
+              <w:rPr>
+                <w:lang w:val="en-GB"/>
+              </w:rPr>
             </w:pPr>
             <w:r>
               <w:rPr>
                 <w:sz w:val="17"/>
                 <w:szCs w:val="17"/>
+                <w:lang w:val="en-GB"/>
               </w:rPr>
               <w:t>Post-1998 stabilisation; NBU heavy FX intervention; no formal anchor; inflation 12–28%</w:t>
             </w:r>
@@ -515,11 +552,15 @@
           <w:p>
             <w:pPr>
               <w:spacing w:before="20" w:after="20"/>
+              <w:rPr>
+                <w:lang w:val="en-GB"/>
+              </w:rPr>
             </w:pPr>
             <w:r>
               <w:rPr>
                 <w:sz w:val="17"/>
                 <w:szCs w:val="17"/>
+                <w:lang w:val="en-GB"/>
               </w:rPr>
               <w:t>Minimal</w:t>
             </w:r>
@@ -527,12 +568,6 @@
         </w:tc>
       </w:tr>
       <w:tr>
-        <w:tblPrEx>
-          <w:tblCellMar>
-            <w:top w:w="0" w:type="dxa"/>
-            <w:bottom w:w="0" w:type="dxa"/>
-          </w:tblCellMar>
-        </w:tblPrEx>
         <w:tc>
           <w:tcPr>
             <w:tcW w:w="900" w:type="dxa"/>
@@ -552,11 +587,15 @@
           <w:p>
             <w:pPr>
               <w:spacing w:before="20" w:after="20"/>
+              <w:rPr>
+                <w:lang w:val="en-GB"/>
+              </w:rPr>
             </w:pPr>
             <w:r>
               <w:rPr>
                 <w:sz w:val="17"/>
                 <w:szCs w:val="17"/>
+                <w:lang w:val="en-GB"/>
               </w:rPr>
               <w:t>2</w:t>
             </w:r>
@@ -581,11 +620,15 @@
           <w:p>
             <w:pPr>
               <w:spacing w:before="20" w:after="20"/>
+              <w:rPr>
+                <w:lang w:val="en-GB"/>
+              </w:rPr>
             </w:pPr>
             <w:r>
               <w:rPr>
                 <w:sz w:val="17"/>
                 <w:szCs w:val="17"/>
+                <w:lang w:val="en-GB"/>
               </w:rPr>
               <w:t>Apr 2005 – Sept 2008</w:t>
             </w:r>
@@ -610,11 +653,15 @@
           <w:p>
             <w:pPr>
               <w:spacing w:before="20" w:after="20"/>
+              <w:rPr>
+                <w:lang w:val="en-GB"/>
+              </w:rPr>
             </w:pPr>
             <w:r>
               <w:rPr>
                 <w:sz w:val="17"/>
                 <w:szCs w:val="17"/>
+                <w:lang w:val="en-GB"/>
               </w:rPr>
               <w:t>5.05 (fixed)</w:t>
             </w:r>
@@ -639,6 +686,9 @@
           <w:p>
             <w:pPr>
               <w:spacing w:before="20" w:after="20"/>
+              <w:rPr>
+                <w:lang w:val="en-GB"/>
+              </w:rPr>
             </w:pPr>
             <w:r>
               <w:rPr>
@@ -646,6 +696,7 @@
                 <w:iCs/>
                 <w:sz w:val="17"/>
                 <w:szCs w:val="17"/>
+                <w:lang w:val="en-GB"/>
               </w:rPr>
               <w:t>Conventional peg to USD</w:t>
             </w:r>
@@ -670,11 +721,15 @@
           <w:p>
             <w:pPr>
               <w:spacing w:before="20" w:after="20"/>
+              <w:rPr>
+                <w:lang w:val="en-GB"/>
+              </w:rPr>
             </w:pPr>
             <w:r>
               <w:rPr>
                 <w:sz w:val="17"/>
                 <w:szCs w:val="17"/>
+                <w:lang w:val="en-GB"/>
               </w:rPr>
               <w:t>Formal peg at 5.05 (21 Apr 2005); commodity boom; demand overheating; inflation reached 31% by mid-2008</w:t>
             </w:r>
@@ -699,11 +754,15 @@
           <w:p>
             <w:pPr>
               <w:spacing w:before="20" w:after="20"/>
+              <w:rPr>
+                <w:lang w:val="en-GB"/>
+              </w:rPr>
             </w:pPr>
             <w:r>
               <w:rPr>
                 <w:sz w:val="17"/>
                 <w:szCs w:val="17"/>
+                <w:lang w:val="en-GB"/>
               </w:rPr>
               <w:t>Minimal</w:t>
             </w:r>
@@ -711,12 +770,6 @@
         </w:tc>
       </w:tr>
       <w:tr>
-        <w:tblPrEx>
-          <w:tblCellMar>
-            <w:top w:w="0" w:type="dxa"/>
-            <w:bottom w:w="0" w:type="dxa"/>
-          </w:tblCellMar>
-        </w:tblPrEx>
         <w:tc>
           <w:tcPr>
             <w:tcW w:w="900" w:type="dxa"/>
@@ -736,11 +789,15 @@
           <w:p>
             <w:pPr>
               <w:spacing w:before="20" w:after="20"/>
+              <w:rPr>
+                <w:lang w:val="en-GB"/>
+              </w:rPr>
             </w:pPr>
             <w:r>
               <w:rPr>
                 <w:sz w:val="17"/>
                 <w:szCs w:val="17"/>
+                <w:lang w:val="en-GB"/>
               </w:rPr>
               <w:t>3</w:t>
             </w:r>
@@ -765,11 +822,15 @@
           <w:p>
             <w:pPr>
               <w:spacing w:before="20" w:after="20"/>
+              <w:rPr>
+                <w:lang w:val="en-GB"/>
+              </w:rPr>
             </w:pPr>
             <w:r>
               <w:rPr>
                 <w:sz w:val="17"/>
                 <w:szCs w:val="17"/>
+                <w:lang w:val="en-GB"/>
               </w:rPr>
               <w:t>Oct 2008 – Dec 2011</w:t>
             </w:r>
@@ -794,11 +855,15 @@
           <w:p>
             <w:pPr>
               <w:spacing w:before="20" w:after="20"/>
+              <w:rPr>
+                <w:lang w:val="en-GB"/>
+              </w:rPr>
             </w:pPr>
             <w:r>
               <w:rPr>
                 <w:sz w:val="17"/>
                 <w:szCs w:val="17"/>
+                <w:lang w:val="en-GB"/>
               </w:rPr>
               <w:t>7.7–8.0 (re-pegged)</w:t>
             </w:r>
@@ -823,6 +888,9 @@
           <w:p>
             <w:pPr>
               <w:spacing w:before="20" w:after="20"/>
+              <w:rPr>
+                <w:lang w:val="en-GB"/>
+              </w:rPr>
             </w:pPr>
             <w:r>
               <w:rPr>
@@ -830,6 +898,7 @@
                 <w:iCs/>
                 <w:sz w:val="17"/>
                 <w:szCs w:val="17"/>
+                <w:lang w:val="en-GB"/>
               </w:rPr>
               <w:t>Stabilised arrangement (peg to USD at new level)</w:t>
             </w:r>
@@ -854,11 +923,15 @@
           <w:p>
             <w:pPr>
               <w:spacing w:before="20" w:after="20"/>
+              <w:rPr>
+                <w:lang w:val="en-GB"/>
+              </w:rPr>
             </w:pPr>
             <w:r>
               <w:rPr>
                 <w:sz w:val="17"/>
                 <w:szCs w:val="17"/>
+                <w:lang w:val="en-GB"/>
               </w:rPr>
               <w:t>GFC: ≈38% depreciation (Sept–Dec 2008); new peg at ~8.0; FX reserves fell from $38B; IMF SBA activated</w:t>
             </w:r>
@@ -883,11 +956,15 @@
           <w:p>
             <w:pPr>
               <w:spacing w:before="20" w:after="20"/>
+              <w:rPr>
+                <w:lang w:val="en-GB"/>
+              </w:rPr>
             </w:pPr>
             <w:r>
               <w:rPr>
                 <w:sz w:val="17"/>
                 <w:szCs w:val="17"/>
+                <w:lang w:val="en-GB"/>
               </w:rPr>
               <w:t>Temporary restrictions during crisis</w:t>
             </w:r>
@@ -895,12 +972,6 @@
         </w:tc>
       </w:tr>
       <w:tr>
-        <w:tblPrEx>
-          <w:tblCellMar>
-            <w:top w:w="0" w:type="dxa"/>
-            <w:bottom w:w="0" w:type="dxa"/>
-          </w:tblCellMar>
-        </w:tblPrEx>
         <w:tc>
           <w:tcPr>
             <w:tcW w:w="900" w:type="dxa"/>
@@ -920,11 +991,15 @@
           <w:p>
             <w:pPr>
               <w:spacing w:before="20" w:after="20"/>
+              <w:rPr>
+                <w:lang w:val="en-GB"/>
+              </w:rPr>
             </w:pPr>
             <w:r>
               <w:rPr>
                 <w:sz w:val="17"/>
                 <w:szCs w:val="17"/>
+                <w:lang w:val="en-GB"/>
               </w:rPr>
               <w:t>4</w:t>
             </w:r>
@@ -949,11 +1024,15 @@
           <w:p>
             <w:pPr>
               <w:spacing w:before="20" w:after="20"/>
+              <w:rPr>
+                <w:lang w:val="en-GB"/>
+              </w:rPr>
             </w:pPr>
             <w:r>
               <w:rPr>
                 <w:sz w:val="17"/>
                 <w:szCs w:val="17"/>
+                <w:lang w:val="en-GB"/>
               </w:rPr>
               <w:t>2012 – Jan 2014</w:t>
             </w:r>
@@ -978,11 +1057,15 @@
           <w:p>
             <w:pPr>
               <w:spacing w:before="20" w:after="20"/>
+              <w:rPr>
+                <w:lang w:val="en-GB"/>
+              </w:rPr>
             </w:pPr>
             <w:r>
               <w:rPr>
                 <w:sz w:val="17"/>
                 <w:szCs w:val="17"/>
+                <w:lang w:val="en-GB"/>
               </w:rPr>
               <w:t>≈8.1–8.2</w:t>
             </w:r>
@@ -1007,6 +1090,9 @@
           <w:p>
             <w:pPr>
               <w:spacing w:before="20" w:after="20"/>
+              <w:rPr>
+                <w:lang w:val="en-GB"/>
+              </w:rPr>
             </w:pPr>
             <w:r>
               <w:rPr>
@@ -1014,6 +1100,7 @@
                 <w:iCs/>
                 <w:sz w:val="17"/>
                 <w:szCs w:val="17"/>
+                <w:lang w:val="en-GB"/>
               </w:rPr>
               <w:t>Other managed arrangement</w:t>
             </w:r>
@@ -1038,11 +1125,15 @@
           <w:p>
             <w:pPr>
               <w:spacing w:before="20" w:after="20"/>
+              <w:rPr>
+                <w:lang w:val="en-GB"/>
+              </w:rPr>
             </w:pPr>
             <w:r>
               <w:rPr>
                 <w:sz w:val="17"/>
                 <w:szCs w:val="17"/>
+                <w:lang w:val="en-GB"/>
               </w:rPr>
               <w:t>NBU smooths FX rate; euro weakness; reserves partially rebuilt; no IT framework; pre-Maidan political instability</w:t>
             </w:r>
@@ -1067,11 +1158,15 @@
           <w:p>
             <w:pPr>
               <w:spacing w:before="20" w:after="20"/>
+              <w:rPr>
+                <w:lang w:val="en-GB"/>
+              </w:rPr>
             </w:pPr>
             <w:r>
               <w:rPr>
                 <w:sz w:val="17"/>
                 <w:szCs w:val="17"/>
+                <w:lang w:val="en-GB"/>
               </w:rPr>
               <w:t>Minimal</w:t>
             </w:r>
@@ -1079,12 +1174,6 @@
         </w:tc>
       </w:tr>
       <w:tr>
-        <w:tblPrEx>
-          <w:tblCellMar>
-            <w:top w:w="0" w:type="dxa"/>
-            <w:bottom w:w="0" w:type="dxa"/>
-          </w:tblCellMar>
-        </w:tblPrEx>
         <w:tc>
           <w:tcPr>
             <w:tcW w:w="900" w:type="dxa"/>
@@ -1104,11 +1193,15 @@
           <w:p>
             <w:pPr>
               <w:spacing w:before="20" w:after="20"/>
+              <w:rPr>
+                <w:lang w:val="en-GB"/>
+              </w:rPr>
             </w:pPr>
             <w:r>
               <w:rPr>
                 <w:sz w:val="17"/>
                 <w:szCs w:val="17"/>
+                <w:lang w:val="en-GB"/>
               </w:rPr>
               <w:t>5</w:t>
             </w:r>
@@ -1133,11 +1226,15 @@
           <w:p>
             <w:pPr>
               <w:spacing w:before="20" w:after="20"/>
+              <w:rPr>
+                <w:lang w:val="en-GB"/>
+              </w:rPr>
             </w:pPr>
             <w:r>
               <w:rPr>
                 <w:sz w:val="17"/>
                 <w:szCs w:val="17"/>
+                <w:lang w:val="en-GB"/>
               </w:rPr>
               <w:t>Feb 2014 – mid-2015</w:t>
             </w:r>
@@ -1162,11 +1259,15 @@
           <w:p>
             <w:pPr>
               <w:spacing w:before="20" w:after="20"/>
+              <w:rPr>
+                <w:lang w:val="en-GB"/>
+              </w:rPr>
             </w:pPr>
             <w:r>
               <w:rPr>
                 <w:sz w:val="17"/>
                 <w:szCs w:val="17"/>
+                <w:lang w:val="en-GB"/>
               </w:rPr>
               <w:t>8.2 → 33 (peak Feb 2015)</w:t>
             </w:r>
@@ -1191,6 +1292,9 @@
           <w:p>
             <w:pPr>
               <w:spacing w:before="20" w:after="20"/>
+              <w:rPr>
+                <w:lang w:val="en-GB"/>
+              </w:rPr>
             </w:pPr>
             <w:r>
               <w:rPr>
@@ -1198,6 +1302,7 @@
                 <w:iCs/>
                 <w:sz w:val="17"/>
                 <w:szCs w:val="17"/>
+                <w:lang w:val="en-GB"/>
               </w:rPr>
               <w:t>Floating (de jure from 7 Feb 2014)</w:t>
             </w:r>
@@ -1222,11 +1327,15 @@
           <w:p>
             <w:pPr>
               <w:spacing w:before="20" w:after="20"/>
+              <w:rPr>
+                <w:lang w:val="en-GB"/>
+              </w:rPr>
             </w:pPr>
             <w:r>
               <w:rPr>
                 <w:sz w:val="17"/>
                 <w:szCs w:val="17"/>
+                <w:lang w:val="en-GB"/>
               </w:rPr>
               <w:t>Euromaidan/Crimea annexation; ~70% cumulative depreciation; reserves collapse; IMF EFF ($17.5B, Mar 2015)</w:t>
             </w:r>
@@ -1251,11 +1360,15 @@
           <w:p>
             <w:pPr>
               <w:spacing w:before="20" w:after="20"/>
+              <w:rPr>
+                <w:lang w:val="en-GB"/>
+              </w:rPr>
             </w:pPr>
             <w:r>
               <w:rPr>
                 <w:sz w:val="17"/>
                 <w:szCs w:val="17"/>
+                <w:lang w:val="en-GB"/>
               </w:rPr>
               <w:t>Severe (from Mar 2015): 75% mandatory FX sale; dividend ban; Reg. No. 160</w:t>
             </w:r>
@@ -1263,12 +1376,6 @@
         </w:tc>
       </w:tr>
       <w:tr>
-        <w:tblPrEx>
-          <w:tblCellMar>
-            <w:top w:w="0" w:type="dxa"/>
-            <w:bottom w:w="0" w:type="dxa"/>
-          </w:tblCellMar>
-        </w:tblPrEx>
         <w:tc>
           <w:tcPr>
             <w:tcW w:w="900" w:type="dxa"/>
@@ -1288,11 +1395,15 @@
           <w:p>
             <w:pPr>
               <w:spacing w:before="20" w:after="20"/>
+              <w:rPr>
+                <w:lang w:val="en-GB"/>
+              </w:rPr>
             </w:pPr>
             <w:r>
               <w:rPr>
                 <w:sz w:val="17"/>
                 <w:szCs w:val="17"/>
+                <w:lang w:val="en-GB"/>
               </w:rPr>
               <w:t>6</w:t>
             </w:r>
@@ -1317,11 +1428,15 @@
           <w:p>
             <w:pPr>
               <w:spacing w:before="20" w:after="20"/>
+              <w:rPr>
+                <w:lang w:val="en-GB"/>
+              </w:rPr>
             </w:pPr>
             <w:r>
               <w:rPr>
                 <w:sz w:val="17"/>
                 <w:szCs w:val="17"/>
+                <w:lang w:val="en-GB"/>
               </w:rPr>
               <w:t>Aug 2015 – Feb 2022</w:t>
             </w:r>
@@ -1346,11 +1461,15 @@
           <w:p>
             <w:pPr>
               <w:spacing w:before="20" w:after="20"/>
+              <w:rPr>
+                <w:lang w:val="en-GB"/>
+              </w:rPr>
             </w:pPr>
             <w:r>
               <w:rPr>
                 <w:sz w:val="17"/>
                 <w:szCs w:val="17"/>
+                <w:lang w:val="en-GB"/>
               </w:rPr>
               <w:t>≈25–28</w:t>
             </w:r>
@@ -1375,6 +1494,9 @@
           <w:p>
             <w:pPr>
               <w:spacing w:before="20" w:after="20"/>
+              <w:rPr>
+                <w:lang w:val="en-GB"/>
+              </w:rPr>
             </w:pPr>
             <w:r>
               <w:rPr>
@@ -1382,6 +1504,7 @@
                 <w:iCs/>
                 <w:sz w:val="17"/>
                 <w:szCs w:val="17"/>
+                <w:lang w:val="en-GB"/>
               </w:rPr>
               <w:t>Floating with inflation targeting</w:t>
             </w:r>
@@ -1406,11 +1529,15 @@
           <w:p>
             <w:pPr>
               <w:spacing w:before="20" w:after="20"/>
+              <w:rPr>
+                <w:lang w:val="en-GB"/>
+              </w:rPr>
             </w:pPr>
             <w:r>
               <w:rPr>
                 <w:sz w:val="17"/>
                 <w:szCs w:val="17"/>
+                <w:lang w:val="en-GB"/>
               </w:rPr>
               <w:t>IT adopted 18 Aug 2015 (Res. 541); target path: 8% → 5%; NBU independence law (Sep 2015); gradual disinflation; by 2019–20 inflation near 5% target</w:t>
             </w:r>
@@ -1435,11 +1562,15 @@
           <w:p>
             <w:pPr>
               <w:spacing w:before="20" w:after="20"/>
+              <w:rPr>
+                <w:lang w:val="en-GB"/>
+              </w:rPr>
             </w:pPr>
             <w:r>
               <w:rPr>
                 <w:sz w:val="17"/>
                 <w:szCs w:val="17"/>
+                <w:lang w:val="en-GB"/>
               </w:rPr>
               <w:t>Gradually eased (2015–2021); phased FX liberalisation</w:t>
             </w:r>
@@ -1447,12 +1578,6 @@
         </w:tc>
       </w:tr>
       <w:tr>
-        <w:tblPrEx>
-          <w:tblCellMar>
-            <w:top w:w="0" w:type="dxa"/>
-            <w:bottom w:w="0" w:type="dxa"/>
-          </w:tblCellMar>
-        </w:tblPrEx>
         <w:tc>
           <w:tcPr>
             <w:tcW w:w="900" w:type="dxa"/>
@@ -1472,11 +1597,15 @@
           <w:p>
             <w:pPr>
               <w:spacing w:before="20" w:after="20"/>
+              <w:rPr>
+                <w:lang w:val="en-GB"/>
+              </w:rPr>
             </w:pPr>
             <w:r>
               <w:rPr>
                 <w:sz w:val="17"/>
                 <w:szCs w:val="17"/>
+                <w:lang w:val="en-GB"/>
               </w:rPr>
               <w:t>7</w:t>
             </w:r>
@@ -1501,11 +1630,15 @@
           <w:p>
             <w:pPr>
               <w:spacing w:before="20" w:after="20"/>
+              <w:rPr>
+                <w:lang w:val="en-GB"/>
+              </w:rPr>
             </w:pPr>
             <w:r>
               <w:rPr>
                 <w:sz w:val="17"/>
                 <w:szCs w:val="17"/>
+                <w:lang w:val="en-GB"/>
               </w:rPr>
               <w:t>24 Feb 2022 – 2 Oct 2023</w:t>
             </w:r>
@@ -1530,11 +1663,15 @@
           <w:p>
             <w:pPr>
               <w:spacing w:before="20" w:after="20"/>
+              <w:rPr>
+                <w:lang w:val="en-GB"/>
+              </w:rPr>
             </w:pPr>
             <w:r>
               <w:rPr>
                 <w:sz w:val="17"/>
                 <w:szCs w:val="17"/>
+                <w:lang w:val="en-GB"/>
               </w:rPr>
               <w:t>29.25 → 36.57 (fixed)</w:t>
             </w:r>
@@ -1559,6 +1696,9 @@
           <w:p>
             <w:pPr>
               <w:spacing w:before="20" w:after="20"/>
+              <w:rPr>
+                <w:lang w:val="en-GB"/>
+              </w:rPr>
             </w:pPr>
             <w:r>
               <w:rPr>
@@ -1566,6 +1706,7 @@
                 <w:iCs/>
                 <w:sz w:val="17"/>
                 <w:szCs w:val="17"/>
+                <w:lang w:val="en-GB"/>
               </w:rPr>
               <w:t>Pegged (wartime emergency)</w:t>
             </w:r>
@@ -1590,11 +1731,15 @@
           <w:p>
             <w:pPr>
               <w:spacing w:before="20" w:after="20"/>
+              <w:rPr>
+                <w:lang w:val="en-GB"/>
+              </w:rPr>
             </w:pPr>
             <w:r>
               <w:rPr>
                 <w:sz w:val="17"/>
                 <w:szCs w:val="17"/>
+                <w:lang w:val="en-GB"/>
               </w:rPr>
               <w:t>Full-scale invasion; FX rate fixed at 29.25; IT suspended; 25% devaluation to 36.57 (21 Jul 2022); inflation peaked ~27%</w:t>
             </w:r>
@@ -1619,11 +1764,15 @@
           <w:p>
             <w:pPr>
               <w:spacing w:before="20" w:after="20"/>
+              <w:rPr>
+                <w:lang w:val="en-GB"/>
+              </w:rPr>
             </w:pPr>
             <w:r>
               <w:rPr>
                 <w:sz w:val="17"/>
                 <w:szCs w:val="17"/>
+                <w:lang w:val="en-GB"/>
               </w:rPr>
               <w:t>Severe (Res. No. 18): comprehensive FX restrictions; mandatory sale requirements</w:t>
             </w:r>
@@ -1631,12 +1780,6 @@
         </w:tc>
       </w:tr>
       <w:tr>
-        <w:tblPrEx>
-          <w:tblCellMar>
-            <w:top w:w="0" w:type="dxa"/>
-            <w:bottom w:w="0" w:type="dxa"/>
-          </w:tblCellMar>
-        </w:tblPrEx>
         <w:tc>
           <w:tcPr>
             <w:tcW w:w="900" w:type="dxa"/>
@@ -1656,11 +1799,15 @@
           <w:p>
             <w:pPr>
               <w:spacing w:before="20" w:after="20"/>
+              <w:rPr>
+                <w:lang w:val="en-GB"/>
+              </w:rPr>
             </w:pPr>
             <w:r>
               <w:rPr>
                 <w:sz w:val="17"/>
                 <w:szCs w:val="17"/>
+                <w:lang w:val="en-GB"/>
               </w:rPr>
               <w:t>8</w:t>
             </w:r>
@@ -1685,11 +1832,15 @@
           <w:p>
             <w:pPr>
               <w:spacing w:before="20" w:after="20"/>
+              <w:rPr>
+                <w:lang w:val="en-GB"/>
+              </w:rPr>
             </w:pPr>
             <w:r>
               <w:rPr>
                 <w:sz w:val="17"/>
                 <w:szCs w:val="17"/>
+                <w:lang w:val="en-GB"/>
               </w:rPr>
               <w:t>3 Oct 2023 – present</w:t>
             </w:r>
@@ -1714,11 +1865,15 @@
           <w:p>
             <w:pPr>
               <w:spacing w:before="20" w:after="20"/>
+              <w:rPr>
+                <w:lang w:val="en-GB"/>
+              </w:rPr>
             </w:pPr>
             <w:r>
               <w:rPr>
                 <w:sz w:val="17"/>
                 <w:szCs w:val="17"/>
+                <w:lang w:val="en-GB"/>
               </w:rPr>
               <w:t>≈37–42 (floating)</w:t>
             </w:r>
@@ -1743,6 +1898,9 @@
           <w:p>
             <w:pPr>
               <w:spacing w:before="20" w:after="20"/>
+              <w:rPr>
+                <w:lang w:val="en-GB"/>
+              </w:rPr>
             </w:pPr>
             <w:r>
               <w:rPr>
@@ -1750,6 +1908,7 @@
                 <w:iCs/>
                 <w:sz w:val="17"/>
                 <w:szCs w:val="17"/>
+                <w:lang w:val="en-GB"/>
               </w:rPr>
               <w:t>Managed float / Flexible IT</w:t>
             </w:r>
@@ -1774,11 +1933,15 @@
           <w:p>
             <w:pPr>
               <w:spacing w:before="20" w:after="20"/>
+              <w:rPr>
+                <w:lang w:val="en-GB"/>
+              </w:rPr>
             </w:pPr>
             <w:r>
               <w:rPr>
                 <w:sz w:val="17"/>
                 <w:szCs w:val="17"/>
+                <w:lang w:val="en-GB"/>
               </w:rPr>
               <w:t>Managed flexibility (3 Oct 2023); flexible IT framework adopted (Sep 2024); 5% target, 3-year horizon; phased normalisation</w:t>
             </w:r>
@@ -1803,11 +1966,15 @@
           <w:p>
             <w:pPr>
               <w:spacing w:before="20" w:after="20"/>
+              <w:rPr>
+                <w:lang w:val="en-GB"/>
+              </w:rPr>
             </w:pPr>
             <w:r>
               <w:rPr>
                 <w:sz w:val="17"/>
                 <w:szCs w:val="17"/>
+                <w:lang w:val="en-GB"/>
               </w:rPr>
               <w:t>Gradually easing; phased liberalisation ongoing</w:t>
             </w:r>
@@ -1816,15 +1983,29 @@
       </w:tr>
     </w:tbl>
     <w:p>
-      <w:r>
+      <w:pPr>
+        <w:rPr>
+          <w:lang w:val="en-GB"/>
+        </w:rPr>
+      </w:pPr>
+      <w:r>
+        <w:rPr>
+          <w:lang w:val="en-GB"/>
+        </w:rPr>
         <w:br w:type="page"/>
       </w:r>
     </w:p>
     <w:p>
       <w:pPr>
         <w:pStyle w:val="Ttulo1"/>
+        <w:rPr>
+          <w:lang w:val="en-GB"/>
+        </w:rPr>
       </w:pPr>
       <w:r>
+        <w:rPr>
+          <w:lang w:val="en-GB"/>
+        </w:rPr>
         <w:lastRenderedPageBreak/>
         <w:t>2. Detailed Discussion of Key Periods</w:t>
       </w:r>
@@ -1832,319 +2013,766 @@
     <w:p>
       <w:pPr>
         <w:pStyle w:val="Ttulo2"/>
+        <w:rPr>
+          <w:lang w:val="en-GB"/>
+        </w:rPr>
       </w:pPr>
       <w:r>
+        <w:rPr>
+          <w:lang w:val="en-GB"/>
+        </w:rPr>
         <w:t>2.1 The Dollar Peg Era (2000–2008)</w:t>
       </w:r>
     </w:p>
     <w:p>
       <w:pPr>
-        <w:spacing w:after="200"/>
+        <w:spacing w:after="200" w:line="360" w:lineRule="auto"/>
+        <w:rPr>
+          <w:lang w:val="en-GB"/>
+        </w:rPr>
       </w:pPr>
       <w:r>
+        <w:rPr>
+          <w:lang w:val="en-GB"/>
+        </w:rPr>
         <w:t>Throughout 2000–2008, the NBU maintained what Calvo and Reinhart (2002) would classify as a textbook case of “fear of floating.”</w:t>
       </w:r>
       <w:r>
         <w:rPr>
           <w:rStyle w:val="Refdenotaderodap"/>
+          <w:lang w:val="en-GB"/>
         </w:rPr>
         <w:footnoteReference w:id="3"/>
       </w:r>
       <w:r>
-        <w:t xml:space="preserve"> While the de jure regime was described as “managed floating,” the NBU intervened heavily in the FX market to maintain the hryvnia within a narrow band around the US dollar. The rate stabilised at approximately UAH 5.4/USD after the 1998–99 crisis, and was formalised as an official peg at UAH 5.05/USD on 21 April 2005. During this period, the impossible trinity was binding: with the exchange rate anchored and capital flows increasingly open, the NBU effectively surrendered independent monetary policy. Interest rates were subordinated to the exchange-rate target, and domestic inflation—which averaged 9–12% annually and spiked above 25% in 2008—was largely determined by external commodity prices and the expansionary fiscal stance, not by active NBU policy.</w:t>
+        <w:rPr>
+          <w:lang w:val="en-GB"/>
+        </w:rPr>
+        <w:t xml:space="preserve"> While the de jure regime was described as “managed floating,” the NBU intervened heavily in the FX market to maintain the hryvnia within a narrow band around the US dollar. The rate stabilised at approximately UAH 5.4/USD after the 1998–99 </w:t>
+      </w:r>
+      <w:r>
+        <w:rPr>
+          <w:lang w:val="en-GB"/>
+        </w:rPr>
+        <w:t>crisis and</w:t>
+      </w:r>
+      <w:r>
+        <w:rPr>
+          <w:lang w:val="en-GB"/>
+        </w:rPr>
+        <w:t xml:space="preserve"> was formalised as an official peg at UAH 5.05/USD on 21 April 2005. During this period, the impossible trinity was binding: with the exchange rate anchored and capital flows increasingly open, the NBU effectively surrendered independent monetary policy. Interest rates were subordinated to the exchange-rate target, and domestic inflation</w:t>
+      </w:r>
+      <w:r>
+        <w:rPr>
+          <w:lang w:val="en-GB"/>
+        </w:rPr>
+        <w:t xml:space="preserve">, </w:t>
+      </w:r>
+      <w:r>
+        <w:rPr>
+          <w:lang w:val="en-GB"/>
+        </w:rPr>
+        <w:t>which averaged 9–12% annually and spiked above 25% in 2008</w:t>
+      </w:r>
+      <w:r>
+        <w:rPr>
+          <w:lang w:val="en-GB"/>
+        </w:rPr>
+        <w:t xml:space="preserve">, </w:t>
+      </w:r>
+      <w:r>
+        <w:rPr>
+          <w:lang w:val="en-GB"/>
+        </w:rPr>
+        <w:t>was largely determined by external commodity prices and the expansionary fiscal stance, not by active NBU policy.</w:t>
       </w:r>
     </w:p>
     <w:p>
       <w:pPr>
         <w:pStyle w:val="Ttulo2"/>
+        <w:rPr>
+          <w:lang w:val="en-GB"/>
+        </w:rPr>
       </w:pPr>
       <w:r>
+        <w:rPr>
+          <w:lang w:val="en-GB"/>
+        </w:rPr>
         <w:t>2.2 The 2008–2009 Crisis and Forced Devaluation</w:t>
       </w:r>
     </w:p>
     <w:p>
       <w:pPr>
-        <w:spacing w:after="200"/>
+        <w:spacing w:after="200" w:line="360" w:lineRule="auto"/>
+        <w:rPr>
+          <w:lang w:val="en-GB"/>
+        </w:rPr>
       </w:pPr>
       <w:r>
+        <w:rPr>
+          <w:lang w:val="en-GB"/>
+        </w:rPr>
         <w:t>The global financial crisis triggered a sudden stop in capital flows and a collapse in steel and commodity export revenues. The NBU was forced to abandon the peg in October 2008, and the hryvnia depreciated approximately 38% in under three months (from UAH 4.85 to UAH 7.88/USD). A new de facto peg was established at approximately UAH 8.0/USD, which would hold until 2014. This episode demonstrated the fundamental vulnerability of Ukraine’s peg regime: the exchange rate served as a shock absorber of last resort, but only through disorderly, large devaluations rather than gradual adjustment. FX reserves, which had peaked near $38 billion, were depleted rapidly. An IMF Stand-By Arrangement was activated to support the balance of payments.</w:t>
       </w:r>
     </w:p>
     <w:p>
       <w:pPr>
         <w:pStyle w:val="Ttulo2"/>
+        <w:rPr>
+          <w:lang w:val="en-GB"/>
+        </w:rPr>
       </w:pPr>
       <w:r>
+        <w:rPr>
+          <w:lang w:val="en-GB"/>
+        </w:rPr>
         <w:t>2.3 The 2014–2015 Crisis: Euromaidan, Crimea, and the Float</w:t>
       </w:r>
     </w:p>
     <w:p>
       <w:pPr>
-        <w:spacing w:after="200"/>
+        <w:spacing w:after="200" w:line="360" w:lineRule="auto"/>
+        <w:rPr>
+          <w:lang w:val="en-GB"/>
+        </w:rPr>
       </w:pPr>
       <w:r>
-        <w:t>The most dramatic regime change in the sample period occurred in February 2014. Following the Euromaidan revolution and the Russian annexation of Crimea, capital flight accelerated and the NBU was forced to allow the hryvnia to float (7 February 2014). The currency depreciated from UAH 8.15/USD to a record low of approximately UAH 33/USD by late February 2015—a cumulative depreciation exceeding 70%. This crisis marked the definitive end of the dollar-peg era. The NBU introduced severe capital controls in March 2015 (Resolution No. 160), including a 75% mandatory FX sale requirement and a ban on dividend repatriation. Year-on-year inflation reached 60.9% in April 2015—the highest in the sample. A $17.5 billion IMF Extended Fund Facility was approved in March 2015, conditional on the NBU’s commitment to adopt inflation targeting.</w:t>
+        <w:rPr>
+          <w:lang w:val="en-GB"/>
+        </w:rPr>
+        <w:t xml:space="preserve">The most dramatic regime </w:t>
+      </w:r>
+      <w:proofErr w:type="gramStart"/>
+      <w:r>
+        <w:rPr>
+          <w:lang w:val="en-GB"/>
+        </w:rPr>
+        <w:t>change</w:t>
+      </w:r>
+      <w:proofErr w:type="gramEnd"/>
+      <w:r>
+        <w:rPr>
+          <w:lang w:val="en-GB"/>
+        </w:rPr>
+        <w:t xml:space="preserve"> in the sample period occurred in February 2014. Following the Euromaidan revolution and the Russian annexation of Crimea, capital flight accelerated and the NBU was forced to allow the hryvnia to float (7 February 2014). The currency depreciated from UAH 8.15/USD to a record low of approximately UAH 33/USD by late February 2015</w:t>
+      </w:r>
+      <w:r>
+        <w:rPr>
+          <w:lang w:val="en-GB"/>
+        </w:rPr>
+        <w:t xml:space="preserve">, </w:t>
+      </w:r>
+      <w:r>
+        <w:rPr>
+          <w:lang w:val="en-GB"/>
+        </w:rPr>
+        <w:t xml:space="preserve">a cumulative depreciation exceeding 70%. This crisis marked the definitive end of the dollar-peg era. The NBU introduced severe capital controls in March 2015, including a 75% mandatory FX sale requirement and a ban on dividend repatriation. Year-on-year inflation reached 60.9% in </w:t>
+      </w:r>
+      <w:r>
+        <w:rPr>
+          <w:lang w:val="en-GB"/>
+        </w:rPr>
+        <w:lastRenderedPageBreak/>
+        <w:t>April 2015—the highest in the sample. A $17.5 billion IMF Extended Fund Facility was approved in March 2015, conditional on the NBU’s commitment to adopt inflation targeting.</w:t>
       </w:r>
     </w:p>
     <w:p>
       <w:pPr>
         <w:pStyle w:val="Ttulo2"/>
+        <w:rPr>
+          <w:lang w:val="en-GB"/>
+        </w:rPr>
       </w:pPr>
       <w:r>
+        <w:rPr>
+          <w:lang w:val="en-GB"/>
+        </w:rPr>
         <w:t>2.4 Inflation Targeting Adoption (2015–2022)</w:t>
       </w:r>
     </w:p>
     <w:p>
       <w:pPr>
-        <w:spacing w:after="200"/>
+        <w:spacing w:after="200" w:line="360" w:lineRule="auto"/>
+        <w:rPr>
+          <w:lang w:val="en-GB"/>
+        </w:rPr>
       </w:pPr>
       <w:r>
+        <w:rPr>
+          <w:lang w:val="en-GB"/>
+        </w:rPr>
         <w:t>The NBU formally adopted an inflation-targeting framework on 18 August 2015 (Board Resolution No. 541).</w:t>
       </w:r>
       <w:r>
         <w:rPr>
           <w:rStyle w:val="Refdenotaderodap"/>
+          <w:lang w:val="en-GB"/>
         </w:rPr>
         <w:footnoteReference w:id="4"/>
       </w:r>
       <w:r>
-        <w:t xml:space="preserve"> The initial target was 8% ±2 percentage points, with a convergence path toward 5% by 2019–2020. The NBU’s institutional independence was strengthened by law in September 2015. This represents the only sustained period in the sample where Ukraine exercised genuine monetary sovereignty: the key policy rate became the primary instrument, the exchange rate floated (though with occasional smoothing interventions), and capital controls were progressively eased. By 2019–2020, inflation had converged near the 5% target—a </w:t>
-      </w:r>
-      <w:r>
-        <w:lastRenderedPageBreak/>
-        <w:t>remarkable achievement. The monetary transmission mechanism functioned through the interest rate channel, as documented by Nikolaychuk and Shpanel (2016) and subsequent NBU research on neutral rates (Grui, Lepushynskyi, and Nikolaychuk, 2018).</w:t>
+        <w:rPr>
+          <w:lang w:val="en-GB"/>
+        </w:rPr>
+        <w:t xml:space="preserve"> The initial target was 8% ±2 percentage points, with a convergence path toward 5% by 2019–2020. The NBU’s institutional independence was strengthened by law in September 2015. This represents the only sustained period in the sample where Ukraine exercised genuine monetary sovereignty: the key policy rate became the primary instrument, the exchange rate floated (though with occasional smoothing interventions), and capital controls were progressively eased. By 2019–2020, inflation had converged near the 5% target—a remarkable achievement. The monetary transmission mechanism functioned through the interest rate channel, as documented by Nikolaychuk and </w:t>
+      </w:r>
+      <w:proofErr w:type="spellStart"/>
+      <w:r>
+        <w:rPr>
+          <w:lang w:val="en-GB"/>
+        </w:rPr>
+        <w:t>Shpanel</w:t>
+      </w:r>
+      <w:proofErr w:type="spellEnd"/>
+      <w:r>
+        <w:rPr>
+          <w:lang w:val="en-GB"/>
+        </w:rPr>
+        <w:t xml:space="preserve"> (2016) and subsequent NBU research on neutral rates (</w:t>
+      </w:r>
+      <w:proofErr w:type="spellStart"/>
+      <w:r>
+        <w:rPr>
+          <w:lang w:val="en-GB"/>
+        </w:rPr>
+        <w:t>Grui</w:t>
+      </w:r>
+      <w:proofErr w:type="spellEnd"/>
+      <w:r>
+        <w:rPr>
+          <w:lang w:val="en-GB"/>
+        </w:rPr>
+        <w:t xml:space="preserve">, </w:t>
+      </w:r>
+      <w:proofErr w:type="spellStart"/>
+      <w:r>
+        <w:rPr>
+          <w:lang w:val="en-GB"/>
+        </w:rPr>
+        <w:t>Lepushynskyi</w:t>
+      </w:r>
+      <w:proofErr w:type="spellEnd"/>
+      <w:r>
+        <w:rPr>
+          <w:lang w:val="en-GB"/>
+        </w:rPr>
+        <w:t>, and Nikolaychuk, 2018).</w:t>
       </w:r>
     </w:p>
     <w:p>
       <w:pPr>
         <w:pStyle w:val="Ttulo2"/>
+        <w:rPr>
+          <w:lang w:val="en-GB"/>
+        </w:rPr>
       </w:pPr>
       <w:r>
+        <w:rPr>
+          <w:lang w:val="en-GB"/>
+        </w:rPr>
         <w:t>2.5 Wartime Fixed Rate and Return to Managed Flexibility (2022–present)</w:t>
       </w:r>
     </w:p>
     <w:p>
       <w:pPr>
-        <w:spacing w:after="200"/>
+        <w:spacing w:after="200" w:line="360" w:lineRule="auto"/>
+        <w:rPr>
+          <w:lang w:val="en-GB"/>
+        </w:rPr>
       </w:pPr>
       <w:r>
+        <w:rPr>
+          <w:lang w:val="en-GB"/>
+        </w:rPr>
         <w:t>Russia’s full-scale invasion on 24 February 2022 prompted the NBU to suspend inflation targeting and fix the exchange rate at UAH 29.25/USD as an emergency anchor.</w:t>
       </w:r>
       <w:r>
         <w:rPr>
           <w:rStyle w:val="Refdenotaderodap"/>
+          <w:lang w:val="en-GB"/>
         </w:rPr>
         <w:footnoteReference w:id="5"/>
       </w:r>
       <w:r>
-        <w:t xml:space="preserve"> Comprehensive capital controls were reimposed (Resolution No. 18). On 21 July 2022, the rate was devalued by 25% to UAH 36.57/USD to reduce the gap with the parallel market. Inflation peaked near 27% in late 2022. From 3 October 2023, the NBU transitioned to managed flexibility, allowing the rate to be determined in the interbank market. A revised “flexible inflation targeting” framework was adopted in September 2024 with a 5% point target and an extended 3-year policy horizon.</w:t>
+        <w:rPr>
+          <w:lang w:val="en-GB"/>
+        </w:rPr>
+        <w:t xml:space="preserve"> Comprehensive capital controls were reimposed (Resolution No. 18). On 21 July 2022, the rate was devalued by 25% to UAH 36.57/USD to reduce the gap with the parallel market. Inflation peaked near 27% in late 2022. From 3 October 2023, the NBU transitioned to managed flexibility, allowing the rate to be determined in the interbank market. A revised “flexible inflation targeting” framework was adopted in September 2024 with a </w:t>
+      </w:r>
+      <w:proofErr w:type="gramStart"/>
+      <w:r>
+        <w:rPr>
+          <w:lang w:val="en-GB"/>
+        </w:rPr>
+        <w:t>5% point</w:t>
+      </w:r>
+      <w:proofErr w:type="gramEnd"/>
+      <w:r>
+        <w:rPr>
+          <w:lang w:val="en-GB"/>
+        </w:rPr>
+        <w:t xml:space="preserve"> target and an extended 3-year policy horizon.</w:t>
       </w:r>
       <w:r>
         <w:rPr>
           <w:rStyle w:val="Refdenotaderodap"/>
+          <w:lang w:val="en-GB"/>
         </w:rPr>
         <w:footnoteReference w:id="6"/>
       </w:r>
       <w:r>
+        <w:rPr>
+          <w:lang w:val="en-GB"/>
+        </w:rPr>
         <w:t xml:space="preserve"> Capital controls continue to be eased gradually.</w:t>
       </w:r>
     </w:p>
     <w:p>
-      <w:r>
+      <w:pPr>
+        <w:rPr>
+          <w:lang w:val="en-GB"/>
+        </w:rPr>
+      </w:pPr>
+      <w:r>
+        <w:rPr>
+          <w:lang w:val="en-GB"/>
+        </w:rPr>
         <w:br w:type="page"/>
       </w:r>
     </w:p>
     <w:p>
       <w:pPr>
         <w:pStyle w:val="Ttulo1"/>
+        <w:rPr>
+          <w:lang w:val="en-GB"/>
+        </w:rPr>
       </w:pPr>
       <w:r>
+        <w:rPr>
+          <w:lang w:val="en-GB"/>
+        </w:rPr>
         <w:lastRenderedPageBreak/>
         <w:t>3. Monetary Sovereignty and Implications for the Counterfactual</w:t>
       </w:r>
     </w:p>
     <w:p>
       <w:pPr>
-        <w:spacing w:after="200"/>
+        <w:spacing w:after="200" w:line="360" w:lineRule="auto"/>
+        <w:rPr>
+          <w:lang w:val="en-GB"/>
+        </w:rPr>
       </w:pPr>
       <w:r>
+        <w:rPr>
+          <w:lang w:val="en-GB"/>
+        </w:rPr>
         <w:t xml:space="preserve">The chronology reveals a critical asymmetry for the counterfactual exercise. Ukraine had </w:t>
       </w:r>
       <w:r>
         <w:rPr>
           <w:b/>
           <w:bCs/>
-        </w:rPr>
-        <w:t>genuine monetary sovereignty for only a brief window</w:t>
-      </w:r>
-      <w:r>
-        <w:t xml:space="preserve">—approximately 2016–2022—when the inflation-targeting framework was operational and the exchange rate floated. During the long dollar-peg periods (2000–2008, 2008–2014, 2022–2023), the NBU’s monetary policy was </w:t>
+          <w:lang w:val="en-GB"/>
+        </w:rPr>
+        <w:t xml:space="preserve">an </w:t>
+      </w:r>
+      <w:r>
+        <w:rPr>
+          <w:lang w:val="en-GB"/>
+        </w:rPr>
+        <w:t>actual</w:t>
+      </w:r>
+      <w:r>
+        <w:rPr>
+          <w:lang w:val="en-GB"/>
+        </w:rPr>
+        <w:t xml:space="preserve"> monetary sovereignty for only a brief window</w:t>
+      </w:r>
+      <w:r>
+        <w:rPr>
+          <w:lang w:val="en-GB"/>
+        </w:rPr>
+        <w:t xml:space="preserve"> (</w:t>
+      </w:r>
+      <w:r>
+        <w:rPr>
+          <w:lang w:val="en-GB"/>
+        </w:rPr>
+        <w:t>approximately 2016–2022</w:t>
+      </w:r>
+      <w:r>
+        <w:rPr>
+          <w:lang w:val="en-GB"/>
+        </w:rPr>
+        <w:t xml:space="preserve">) </w:t>
+      </w:r>
+      <w:r>
+        <w:rPr>
+          <w:lang w:val="en-GB"/>
+        </w:rPr>
+        <w:t xml:space="preserve">when the inflation-targeting framework was operational and the exchange rate floated. During the long dollar-peg </w:t>
+      </w:r>
+      <w:r>
+        <w:rPr>
+          <w:lang w:val="en-GB"/>
+        </w:rPr>
+        <w:t>periods, the</w:t>
+      </w:r>
+      <w:r>
+        <w:rPr>
+          <w:lang w:val="en-GB"/>
+        </w:rPr>
+        <w:t xml:space="preserve"> NBU’s monetary policy was </w:t>
       </w:r>
       <w:r>
         <w:rPr>
           <w:i/>
           <w:iCs/>
+          <w:lang w:val="en-GB"/>
         </w:rPr>
         <w:t>de facto constrained by the exchange-rate anchor</w:t>
       </w:r>
       <w:r>
-        <w:t>. Under the peg, the impossible trinity bound: with open (or opening) capital flows, fixing the exchange rate meant forfeiting independent interest-rate policy. In these periods, Ukraine’s monetary regime was already functionally similar to a fixed exchange-rate arrangement—albeit pegged to the dollar rather than the euro.</w:t>
+        <w:rPr>
+          <w:lang w:val="en-GB"/>
+        </w:rPr>
+        <w:t xml:space="preserve">. Under the peg, the impossible trinity </w:t>
+      </w:r>
+      <w:proofErr w:type="gramStart"/>
+      <w:r>
+        <w:rPr>
+          <w:lang w:val="en-GB"/>
+        </w:rPr>
+        <w:t>bound:</w:t>
+      </w:r>
+      <w:proofErr w:type="gramEnd"/>
+      <w:r>
+        <w:rPr>
+          <w:lang w:val="en-GB"/>
+        </w:rPr>
+        <w:t xml:space="preserve"> with open (or opening) capital flows, fixing the exchange rate meant forfeiting independent interest-rate policy. In these periods, Ukraine’s monetary regime was already functionally similar to a fixed exchange-rate arrangement</w:t>
+      </w:r>
+      <w:r>
+        <w:rPr>
+          <w:lang w:val="en-GB"/>
+        </w:rPr>
+        <w:t>.</w:t>
       </w:r>
     </w:p>
     <w:p>
       <w:pPr>
-        <w:spacing w:after="200"/>
+        <w:spacing w:after="200" w:line="360" w:lineRule="auto"/>
+        <w:rPr>
+          <w:lang w:val="en-GB"/>
+        </w:rPr>
       </w:pPr>
       <w:r>
-        <w:t xml:space="preserve">This has a direct implication for the counterfactual “treatment” of Euro Area membership. During the peg periods, hypothetical euro adoption would not have represented a large change in monetary regime—Ukraine was already constrained. The counterfactual treatment is therefore </w:t>
-      </w:r>
-      <w:r>
-        <w:rPr>
-          <w:b/>
-          <w:bCs/>
-        </w:rPr>
-        <w:t>concentrated in the episodes where Ukraine deviated from its peg</w:t>
-      </w:r>
-      <w:r>
+        <w:rPr>
+          <w:lang w:val="en-GB"/>
+        </w:rPr>
+        <w:t>This has a direct implication for the counterfactual “treatment” of Euro Area membership. During the peg periods, hypothetical euro adoption would not have represented a large change in monetary regime</w:t>
+      </w:r>
+      <w:r>
+        <w:rPr>
+          <w:lang w:val="en-GB"/>
+        </w:rPr>
+        <w:t xml:space="preserve">, as </w:t>
+      </w:r>
+      <w:r>
+        <w:rPr>
+          <w:lang w:val="en-GB"/>
+        </w:rPr>
+        <w:t>Ukraine was already constrained</w:t>
+      </w:r>
+      <w:r>
+        <w:rPr>
+          <w:lang w:val="en-GB"/>
+        </w:rPr>
+        <w:t xml:space="preserve"> by the peg</w:t>
+      </w:r>
+      <w:r>
+        <w:rPr>
+          <w:lang w:val="en-GB"/>
+        </w:rPr>
+        <w:t xml:space="preserve">. </w:t>
+      </w:r>
+      <w:r>
+        <w:rPr>
+          <w:lang w:val="en-GB"/>
+        </w:rPr>
+        <w:t>The counterfactual treatment is therefore concentrated in the episodes where Ukraine deviated from its peg</w:t>
+      </w:r>
+      <w:r>
+        <w:rPr>
+          <w:lang w:val="en-GB"/>
+        </w:rPr>
         <w:t>: the three major devaluation crises (2008, 2014–2015, 2022) and the post-2016 inflation-targeting period. Under Euro Area membership, these devaluations would have been impossible; adjustment would instead have occurred through internal devaluation (wage and price deflation)—as experienced by Greece, Ireland, and the Baltic states. The identification strategy for Part B must account for this time-varying treatment intensity.</w:t>
       </w:r>
     </w:p>
     <w:p>
       <w:pPr>
         <w:pStyle w:val="Ttulo1"/>
+        <w:rPr>
+          <w:lang w:val="en-GB"/>
+        </w:rPr>
       </w:pPr>
       <w:r>
+        <w:rPr>
+          <w:lang w:val="en-GB"/>
+        </w:rPr>
         <w:t>4. Sources</w:t>
       </w:r>
     </w:p>
     <w:p>
       <w:pPr>
-        <w:spacing w:before="40" w:after="40"/>
+        <w:spacing w:before="40" w:after="40" w:line="360" w:lineRule="auto"/>
         <w:ind w:left="360" w:hanging="360"/>
+        <w:rPr>
+          <w:lang w:val="en-GB"/>
+        </w:rPr>
       </w:pPr>
       <w:r>
         <w:rPr>
           <w:sz w:val="20"/>
           <w:szCs w:val="20"/>
+          <w:lang w:val="en-GB"/>
         </w:rPr>
         <w:t>Banque de France (2023), “Monetary policy in times of war: the case of Ukraine.”</w:t>
       </w:r>
     </w:p>
     <w:p>
       <w:pPr>
-        <w:spacing w:before="40" w:after="40"/>
+        <w:spacing w:before="40" w:after="40" w:line="360" w:lineRule="auto"/>
         <w:ind w:left="360" w:hanging="360"/>
+        <w:rPr>
+          <w:lang w:val="en-GB"/>
+        </w:rPr>
       </w:pPr>
       <w:r>
         <w:rPr>
           <w:sz w:val="20"/>
           <w:szCs w:val="20"/>
+          <w:lang w:val="en-GB"/>
         </w:rPr>
         <w:t>Calvo, G. and Reinhart, C. (2002), “Fear of Floating,” Quarterly Journal of Economics, 117(2), pp. 379–408.</w:t>
       </w:r>
     </w:p>
     <w:p>
       <w:pPr>
-        <w:spacing w:before="40" w:after="40"/>
+        <w:spacing w:before="40" w:after="40" w:line="360" w:lineRule="auto"/>
         <w:ind w:left="360" w:hanging="360"/>
+        <w:rPr>
+          <w:lang w:val="en-GB"/>
+        </w:rPr>
       </w:pPr>
       <w:r>
         <w:rPr>
           <w:sz w:val="20"/>
           <w:szCs w:val="20"/>
-        </w:rPr>
-        <w:t>Grui, A., Lepushynskyi, V. and Nikolaychuk, S. (2018), “A Neutral Real Interest Rate in a Small Open Economy: Application to Ukraine,” Visnyk of the National Bank of Ukraine.</w:t>
+          <w:lang w:val="en-GB"/>
+        </w:rPr>
+        <w:t xml:space="preserve">Grui, A., </w:t>
+      </w:r>
+      <w:proofErr w:type="spellStart"/>
+      <w:r>
+        <w:rPr>
+          <w:sz w:val="20"/>
+          <w:szCs w:val="20"/>
+          <w:lang w:val="en-GB"/>
+        </w:rPr>
+        <w:t>Lepushynskyi</w:t>
+      </w:r>
+      <w:proofErr w:type="spellEnd"/>
+      <w:r>
+        <w:rPr>
+          <w:sz w:val="20"/>
+          <w:szCs w:val="20"/>
+          <w:lang w:val="en-GB"/>
+        </w:rPr>
+        <w:t xml:space="preserve">, V. and Nikolaychuk, S. (2018), “A Neutral Real Interest Rate in a Small Open Economy: Application to Ukraine,” </w:t>
+      </w:r>
+      <w:proofErr w:type="spellStart"/>
+      <w:r>
+        <w:rPr>
+          <w:sz w:val="20"/>
+          <w:szCs w:val="20"/>
+          <w:lang w:val="en-GB"/>
+        </w:rPr>
+        <w:t>Visnyk</w:t>
+      </w:r>
+      <w:proofErr w:type="spellEnd"/>
+      <w:r>
+        <w:rPr>
+          <w:sz w:val="20"/>
+          <w:szCs w:val="20"/>
+          <w:lang w:val="en-GB"/>
+        </w:rPr>
+        <w:t xml:space="preserve"> of the National Bank of Ukraine.</w:t>
       </w:r>
     </w:p>
     <w:p>
       <w:pPr>
-        <w:spacing w:before="40" w:after="40"/>
+        <w:spacing w:before="40" w:after="40" w:line="360" w:lineRule="auto"/>
         <w:ind w:left="360" w:hanging="360"/>
+        <w:rPr>
+          <w:lang w:val="en-GB"/>
+        </w:rPr>
       </w:pPr>
       <w:r>
         <w:rPr>
           <w:sz w:val="20"/>
           <w:szCs w:val="20"/>
+          <w:lang w:val="en-GB"/>
         </w:rPr>
         <w:t>IMF, Annual Report on Exchange Arrangements and Exchange Restrictions (AREAER), various years.</w:t>
       </w:r>
     </w:p>
     <w:p>
       <w:pPr>
-        <w:spacing w:before="40" w:after="40"/>
+        <w:spacing w:before="40" w:after="40" w:line="360" w:lineRule="auto"/>
         <w:ind w:left="360" w:hanging="360"/>
+        <w:rPr>
+          <w:lang w:val="en-GB"/>
+        </w:rPr>
       </w:pPr>
       <w:r>
         <w:rPr>
           <w:sz w:val="20"/>
           <w:szCs w:val="20"/>
+          <w:lang w:val="en-GB"/>
         </w:rPr>
         <w:t>IMF, Ukraine: Article IV Consultation Staff Reports, 2004, 2008, 2013, 2016.</w:t>
       </w:r>
     </w:p>
     <w:p>
       <w:pPr>
-        <w:spacing w:before="40" w:after="40"/>
+        <w:spacing w:before="40" w:after="40" w:line="360" w:lineRule="auto"/>
         <w:ind w:left="360" w:hanging="360"/>
+        <w:rPr>
+          <w:lang w:val="en-GB"/>
+        </w:rPr>
       </w:pPr>
       <w:r>
         <w:rPr>
           <w:sz w:val="20"/>
           <w:szCs w:val="20"/>
+          <w:lang w:val="en-GB"/>
         </w:rPr>
         <w:t>National Bank of Ukraine (2015), Resolution No. 541 on Inflation Targeting.</w:t>
       </w:r>
     </w:p>
     <w:p>
       <w:pPr>
-        <w:spacing w:before="40" w:after="40"/>
+        <w:spacing w:before="40" w:after="40" w:line="360" w:lineRule="auto"/>
         <w:ind w:left="360" w:hanging="360"/>
+        <w:rPr>
+          <w:lang w:val="en-GB"/>
+        </w:rPr>
       </w:pPr>
       <w:r>
         <w:rPr>
           <w:sz w:val="20"/>
           <w:szCs w:val="20"/>
+          <w:lang w:val="en-GB"/>
         </w:rPr>
         <w:t>National Bank of Ukraine (2024), Key Principles of Monetary Policy (Flexible IT framework).</w:t>
       </w:r>
     </w:p>
     <w:p>
       <w:pPr>
-        <w:spacing w:before="40" w:after="40"/>
+        <w:spacing w:before="40" w:after="40" w:line="360" w:lineRule="auto"/>
         <w:ind w:left="360" w:hanging="360"/>
+        <w:rPr>
+          <w:lang w:val="en-GB"/>
+        </w:rPr>
       </w:pPr>
       <w:r>
         <w:rPr>
           <w:sz w:val="20"/>
           <w:szCs w:val="20"/>
-        </w:rPr>
-        <w:t>Nikolaychuk, S. and Shpanel, Y. (2016), “Using Macroeconomic Models for Monetary Policy in Ukraine,” Visnyk of the National Bank of Ukraine.</w:t>
+          <w:lang w:val="en-GB"/>
+        </w:rPr>
+        <w:t xml:space="preserve">Nikolaychuk, S. and </w:t>
+      </w:r>
+      <w:proofErr w:type="spellStart"/>
+      <w:r>
+        <w:rPr>
+          <w:sz w:val="20"/>
+          <w:szCs w:val="20"/>
+          <w:lang w:val="en-GB"/>
+        </w:rPr>
+        <w:t>Shpanel</w:t>
+      </w:r>
+      <w:proofErr w:type="spellEnd"/>
+      <w:r>
+        <w:rPr>
+          <w:sz w:val="20"/>
+          <w:szCs w:val="20"/>
+          <w:lang w:val="en-GB"/>
+        </w:rPr>
+        <w:t xml:space="preserve">, Y. (2016), “Using Macroeconomic Models for Monetary Policy in Ukraine,” </w:t>
+      </w:r>
+      <w:proofErr w:type="spellStart"/>
+      <w:r>
+        <w:rPr>
+          <w:sz w:val="20"/>
+          <w:szCs w:val="20"/>
+          <w:lang w:val="en-GB"/>
+        </w:rPr>
+        <w:t>Visnyk</w:t>
+      </w:r>
+      <w:proofErr w:type="spellEnd"/>
+      <w:r>
+        <w:rPr>
+          <w:sz w:val="20"/>
+          <w:szCs w:val="20"/>
+          <w:lang w:val="en-GB"/>
+        </w:rPr>
+        <w:t xml:space="preserve"> of the National Bank of Ukraine.</w:t>
       </w:r>
     </w:p>
     <w:p>
       <w:pPr>
-        <w:spacing w:before="40" w:after="40"/>
+        <w:spacing w:before="40" w:after="40" w:line="360" w:lineRule="auto"/>
         <w:ind w:left="360" w:hanging="360"/>
+        <w:rPr>
+          <w:lang w:val="en-GB"/>
+        </w:rPr>
       </w:pPr>
       <w:r>
         <w:rPr>
           <w:sz w:val="20"/>
           <w:szCs w:val="20"/>
+          <w:lang w:val="en-GB"/>
         </w:rPr>
         <w:t>Petryk, O. (2006), “History of Monetary Development in Ukraine,” Bank and Credit, National Bank of Poland.</w:t>
       </w:r>
     </w:p>
     <w:p>
       <w:pPr>
-        <w:spacing w:before="40" w:after="40"/>
+        <w:spacing w:before="40" w:after="40" w:line="360" w:lineRule="auto"/>
         <w:ind w:left="360" w:hanging="360"/>
+        <w:rPr>
+          <w:lang w:val="en-GB"/>
+        </w:rPr>
       </w:pPr>
+      <w:proofErr w:type="spellStart"/>
       <w:r>
         <w:rPr>
           <w:sz w:val="20"/>
           <w:szCs w:val="20"/>
-        </w:rPr>
-        <w:t>VoxUkraine (2025), “A Decade of Inflation Targeting in Ukraine: Lessons for a New Era of Uncertainty.”</w:t>
+          <w:lang w:val="en-GB"/>
+        </w:rPr>
+        <w:t>VoxUkraine</w:t>
+      </w:r>
+      <w:proofErr w:type="spellEnd"/>
+      <w:r>
+        <w:rPr>
+          <w:sz w:val="20"/>
+          <w:szCs w:val="20"/>
+          <w:lang w:val="en-GB"/>
+        </w:rPr>
+        <w:t xml:space="preserve"> (2025), “A Decade of Inflation Targeting in Ukraine: Lessons for a New Era of Uncertainty.”</w:t>
       </w:r>
     </w:p>
     <w:sectPr>
@@ -2268,14 +2896,117 @@
           <w:sz w:val="18"/>
           <w:szCs w:val="18"/>
         </w:rPr>
-        <w:t>IMF, Annual Report on Exchange Arrangements and Exchange Restrictions</w:t>
-      </w:r>
-      <w:r>
-        <w:rPr>
-          <w:sz w:val="18"/>
-          <w:szCs w:val="18"/>
-        </w:rPr>
-        <w:t>, various years (2001–2025).</w:t>
+        <w:t xml:space="preserve">IMF, Annual Report </w:t>
+      </w:r>
+      <w:proofErr w:type="spellStart"/>
+      <w:r>
+        <w:rPr>
+          <w:i/>
+          <w:iCs/>
+          <w:sz w:val="18"/>
+          <w:szCs w:val="18"/>
+        </w:rPr>
+        <w:t>on</w:t>
+      </w:r>
+      <w:proofErr w:type="spellEnd"/>
+      <w:r>
+        <w:rPr>
+          <w:i/>
+          <w:iCs/>
+          <w:sz w:val="18"/>
+          <w:szCs w:val="18"/>
+        </w:rPr>
+        <w:t xml:space="preserve"> Exchange </w:t>
+      </w:r>
+      <w:proofErr w:type="spellStart"/>
+      <w:r>
+        <w:rPr>
+          <w:i/>
+          <w:iCs/>
+          <w:sz w:val="18"/>
+          <w:szCs w:val="18"/>
+        </w:rPr>
+        <w:t>Arrangements</w:t>
+      </w:r>
+      <w:proofErr w:type="spellEnd"/>
+      <w:r>
+        <w:rPr>
+          <w:i/>
+          <w:iCs/>
+          <w:sz w:val="18"/>
+          <w:szCs w:val="18"/>
+        </w:rPr>
+        <w:t xml:space="preserve"> </w:t>
+      </w:r>
+      <w:proofErr w:type="spellStart"/>
+      <w:r>
+        <w:rPr>
+          <w:i/>
+          <w:iCs/>
+          <w:sz w:val="18"/>
+          <w:szCs w:val="18"/>
+        </w:rPr>
+        <w:t>and</w:t>
+      </w:r>
+      <w:proofErr w:type="spellEnd"/>
+      <w:r>
+        <w:rPr>
+          <w:i/>
+          <w:iCs/>
+          <w:sz w:val="18"/>
+          <w:szCs w:val="18"/>
+        </w:rPr>
+        <w:t xml:space="preserve"> Exchange </w:t>
+      </w:r>
+      <w:proofErr w:type="spellStart"/>
+      <w:r>
+        <w:rPr>
+          <w:i/>
+          <w:iCs/>
+          <w:sz w:val="18"/>
+          <w:szCs w:val="18"/>
+        </w:rPr>
+        <w:t>Restrictions</w:t>
+      </w:r>
+      <w:proofErr w:type="spellEnd"/>
+      <w:r>
+        <w:rPr>
+          <w:sz w:val="18"/>
+          <w:szCs w:val="18"/>
+        </w:rPr>
+        <w:t xml:space="preserve">, </w:t>
+      </w:r>
+      <w:proofErr w:type="spellStart"/>
+      <w:r>
+        <w:rPr>
+          <w:sz w:val="18"/>
+          <w:szCs w:val="18"/>
+        </w:rPr>
+        <w:t>various</w:t>
+      </w:r>
+      <w:proofErr w:type="spellEnd"/>
+      <w:r>
+        <w:rPr>
+          <w:sz w:val="18"/>
+          <w:szCs w:val="18"/>
+        </w:rPr>
+        <w:t xml:space="preserve"> </w:t>
+      </w:r>
+      <w:proofErr w:type="spellStart"/>
+      <w:r>
+        <w:rPr>
+          <w:sz w:val="18"/>
+          <w:szCs w:val="18"/>
+        </w:rPr>
+        <w:t>years</w:t>
+      </w:r>
+      <w:proofErr w:type="spellEnd"/>
+      <w:r>
+        <w:rPr>
+          <w:sz w:val="18"/>
+          <w:szCs w:val="18"/>
+        </w:rPr>
+        <w:t xml:space="preserve"> (2001–2025).</w:t>
       </w:r>
     </w:p>
   </w:footnote>
@@ -2287,12 +3018,101 @@
         </w:rPr>
         <w:footnoteRef/>
       </w:r>
-      <w:r>
-        <w:rPr>
-          <w:sz w:val="18"/>
-          <w:szCs w:val="18"/>
-        </w:rPr>
-        <w:t xml:space="preserve">Petryk, O. (2006), “History of Monetary Development in Ukraine,” </w:t>
+      <w:proofErr w:type="spellStart"/>
+      <w:r>
+        <w:rPr>
+          <w:sz w:val="18"/>
+          <w:szCs w:val="18"/>
+        </w:rPr>
+        <w:t>Petryk</w:t>
+      </w:r>
+      <w:proofErr w:type="spellEnd"/>
+      <w:r>
+        <w:rPr>
+          <w:sz w:val="18"/>
+          <w:szCs w:val="18"/>
+        </w:rPr>
+        <w:t>, O. (2006), “</w:t>
+      </w:r>
+      <w:proofErr w:type="spellStart"/>
+      <w:r>
+        <w:rPr>
+          <w:sz w:val="18"/>
+          <w:szCs w:val="18"/>
+        </w:rPr>
+        <w:t>History</w:t>
+      </w:r>
+      <w:proofErr w:type="spellEnd"/>
+      <w:r>
+        <w:rPr>
+          <w:sz w:val="18"/>
+          <w:szCs w:val="18"/>
+        </w:rPr>
+        <w:t xml:space="preserve"> </w:t>
+      </w:r>
+      <w:proofErr w:type="spellStart"/>
+      <w:r>
+        <w:rPr>
+          <w:sz w:val="18"/>
+          <w:szCs w:val="18"/>
+        </w:rPr>
+        <w:t>of</w:t>
+      </w:r>
+      <w:proofErr w:type="spellEnd"/>
+      <w:r>
+        <w:rPr>
+          <w:sz w:val="18"/>
+          <w:szCs w:val="18"/>
+        </w:rPr>
+        <w:t xml:space="preserve"> </w:t>
+      </w:r>
+      <w:proofErr w:type="spellStart"/>
+      <w:r>
+        <w:rPr>
+          <w:sz w:val="18"/>
+          <w:szCs w:val="18"/>
+        </w:rPr>
+        <w:t>Monetary</w:t>
+      </w:r>
+      <w:proofErr w:type="spellEnd"/>
+      <w:r>
+        <w:rPr>
+          <w:sz w:val="18"/>
+          <w:szCs w:val="18"/>
+        </w:rPr>
+        <w:t xml:space="preserve"> </w:t>
+      </w:r>
+      <w:proofErr w:type="spellStart"/>
+      <w:r>
+        <w:rPr>
+          <w:sz w:val="18"/>
+          <w:szCs w:val="18"/>
+        </w:rPr>
+        <w:t>Development</w:t>
+      </w:r>
+      <w:proofErr w:type="spellEnd"/>
+      <w:r>
+        <w:rPr>
+          <w:sz w:val="18"/>
+          <w:szCs w:val="18"/>
+        </w:rPr>
+        <w:t xml:space="preserve"> in </w:t>
+      </w:r>
+      <w:proofErr w:type="spellStart"/>
+      <w:r>
+        <w:rPr>
+          <w:sz w:val="18"/>
+          <w:szCs w:val="18"/>
+        </w:rPr>
+        <w:t>Ukraine</w:t>
+      </w:r>
+      <w:proofErr w:type="spellEnd"/>
+      <w:r>
+        <w:rPr>
+          <w:sz w:val="18"/>
+          <w:szCs w:val="18"/>
+        </w:rPr>
+        <w:t xml:space="preserve">,” </w:t>
       </w:r>
       <w:r>
         <w:rPr>
@@ -2301,14 +3121,93 @@
           <w:sz w:val="18"/>
           <w:szCs w:val="18"/>
         </w:rPr>
-        <w:t>Bank and Credit</w:t>
-      </w:r>
-      <w:r>
-        <w:rPr>
-          <w:sz w:val="18"/>
-          <w:szCs w:val="18"/>
-        </w:rPr>
-        <w:t>, National Bank of Poland.</w:t>
+        <w:t xml:space="preserve">Bank </w:t>
+      </w:r>
+      <w:proofErr w:type="spellStart"/>
+      <w:r>
+        <w:rPr>
+          <w:i/>
+          <w:iCs/>
+          <w:sz w:val="18"/>
+          <w:szCs w:val="18"/>
+        </w:rPr>
+        <w:t>and</w:t>
+      </w:r>
+      <w:proofErr w:type="spellEnd"/>
+      <w:r>
+        <w:rPr>
+          <w:i/>
+          <w:iCs/>
+          <w:sz w:val="18"/>
+          <w:szCs w:val="18"/>
+        </w:rPr>
+        <w:t xml:space="preserve"> </w:t>
+      </w:r>
+      <w:proofErr w:type="spellStart"/>
+      <w:r>
+        <w:rPr>
+          <w:i/>
+          <w:iCs/>
+          <w:sz w:val="18"/>
+          <w:szCs w:val="18"/>
+        </w:rPr>
+        <w:t>Credit</w:t>
+      </w:r>
+      <w:proofErr w:type="spellEnd"/>
+      <w:r>
+        <w:rPr>
+          <w:sz w:val="18"/>
+          <w:szCs w:val="18"/>
+        </w:rPr>
+        <w:t xml:space="preserve">, </w:t>
+      </w:r>
+      <w:proofErr w:type="spellStart"/>
+      <w:r>
+        <w:rPr>
+          <w:sz w:val="18"/>
+          <w:szCs w:val="18"/>
+        </w:rPr>
+        <w:t>National</w:t>
+      </w:r>
+      <w:proofErr w:type="spellEnd"/>
+      <w:r>
+        <w:rPr>
+          <w:sz w:val="18"/>
+          <w:szCs w:val="18"/>
+        </w:rPr>
+        <w:t xml:space="preserve"> Bank </w:t>
+      </w:r>
+      <w:proofErr w:type="spellStart"/>
+      <w:r>
+        <w:rPr>
+          <w:sz w:val="18"/>
+          <w:szCs w:val="18"/>
+        </w:rPr>
+        <w:t>of</w:t>
+      </w:r>
+      <w:proofErr w:type="spellEnd"/>
+      <w:r>
+        <w:rPr>
+          <w:sz w:val="18"/>
+          <w:szCs w:val="18"/>
+        </w:rPr>
+        <w:t xml:space="preserve"> </w:t>
+      </w:r>
+      <w:proofErr w:type="spellStart"/>
+      <w:r>
+        <w:rPr>
+          <w:sz w:val="18"/>
+          <w:szCs w:val="18"/>
+        </w:rPr>
+        <w:t>Poland</w:t>
+      </w:r>
+      <w:proofErr w:type="spellEnd"/>
+      <w:r>
+        <w:rPr>
+          <w:sz w:val="18"/>
+          <w:szCs w:val="18"/>
+        </w:rPr>
+        <w:t>.</w:t>
       </w:r>
     </w:p>
   </w:footnote>
@@ -2325,8 +3224,41 @@
           <w:sz w:val="18"/>
           <w:szCs w:val="18"/>
         </w:rPr>
-        <w:t xml:space="preserve">Calvo, G. and Reinhart, C. (2002), “Fear of Floating,” </w:t>
-      </w:r>
+        <w:t xml:space="preserve">Calvo, G. </w:t>
+      </w:r>
+      <w:proofErr w:type="spellStart"/>
+      <w:r>
+        <w:rPr>
+          <w:sz w:val="18"/>
+          <w:szCs w:val="18"/>
+        </w:rPr>
+        <w:t>and</w:t>
+      </w:r>
+      <w:proofErr w:type="spellEnd"/>
+      <w:r>
+        <w:rPr>
+          <w:sz w:val="18"/>
+          <w:szCs w:val="18"/>
+        </w:rPr>
+        <w:t xml:space="preserve"> Reinhart, C. (2002), “Fear </w:t>
+      </w:r>
+      <w:proofErr w:type="spellStart"/>
+      <w:r>
+        <w:rPr>
+          <w:sz w:val="18"/>
+          <w:szCs w:val="18"/>
+        </w:rPr>
+        <w:t>of</w:t>
+      </w:r>
+      <w:proofErr w:type="spellEnd"/>
+      <w:r>
+        <w:rPr>
+          <w:sz w:val="18"/>
+          <w:szCs w:val="18"/>
+        </w:rPr>
+        <w:t xml:space="preserve"> Floating,” </w:t>
+      </w:r>
+      <w:proofErr w:type="spellStart"/>
       <w:r>
         <w:rPr>
           <w:i/>
@@ -2334,8 +3266,69 @@
           <w:sz w:val="18"/>
           <w:szCs w:val="18"/>
         </w:rPr>
-        <w:t>Quarterly Journal of Economics</w:t>
-      </w:r>
+        <w:t>Quarterly</w:t>
+      </w:r>
+      <w:proofErr w:type="spellEnd"/>
+      <w:r>
+        <w:rPr>
+          <w:i/>
+          <w:iCs/>
+          <w:sz w:val="18"/>
+          <w:szCs w:val="18"/>
+        </w:rPr>
+        <w:t xml:space="preserve"> </w:t>
+      </w:r>
+      <w:proofErr w:type="spellStart"/>
+      <w:r>
+        <w:rPr>
+          <w:i/>
+          <w:iCs/>
+          <w:sz w:val="18"/>
+          <w:szCs w:val="18"/>
+        </w:rPr>
+        <w:t>Journal</w:t>
+      </w:r>
+      <w:proofErr w:type="spellEnd"/>
+      <w:r>
+        <w:rPr>
+          <w:i/>
+          <w:iCs/>
+          <w:sz w:val="18"/>
+          <w:szCs w:val="18"/>
+        </w:rPr>
+        <w:t xml:space="preserve"> </w:t>
+      </w:r>
+      <w:proofErr w:type="spellStart"/>
+      <w:r>
+        <w:rPr>
+          <w:i/>
+          <w:iCs/>
+          <w:sz w:val="18"/>
+          <w:szCs w:val="18"/>
+        </w:rPr>
+        <w:t>of</w:t>
+      </w:r>
+      <w:proofErr w:type="spellEnd"/>
+      <w:r>
+        <w:rPr>
+          <w:i/>
+          <w:iCs/>
+          <w:sz w:val="18"/>
+          <w:szCs w:val="18"/>
+        </w:rPr>
+        <w:t xml:space="preserve"> </w:t>
+      </w:r>
+      <w:proofErr w:type="spellStart"/>
+      <w:r>
+        <w:rPr>
+          <w:i/>
+          <w:iCs/>
+          <w:sz w:val="18"/>
+          <w:szCs w:val="18"/>
+        </w:rPr>
+        <w:t>Economics</w:t>
+      </w:r>
+      <w:proofErr w:type="spellEnd"/>
       <w:r>
         <w:rPr>
           <w:sz w:val="18"/>
@@ -2353,12 +3346,69 @@
         </w:rPr>
         <w:footnoteRef/>
       </w:r>
-      <w:r>
-        <w:rPr>
-          <w:sz w:val="18"/>
-          <w:szCs w:val="18"/>
-        </w:rPr>
-        <w:t>National Bank of Ukraine, Resolution No. 541, 18 August 2015.</w:t>
+      <w:proofErr w:type="spellStart"/>
+      <w:r>
+        <w:rPr>
+          <w:sz w:val="18"/>
+          <w:szCs w:val="18"/>
+        </w:rPr>
+        <w:t>National</w:t>
+      </w:r>
+      <w:proofErr w:type="spellEnd"/>
+      <w:r>
+        <w:rPr>
+          <w:sz w:val="18"/>
+          <w:szCs w:val="18"/>
+        </w:rPr>
+        <w:t xml:space="preserve"> Bank </w:t>
+      </w:r>
+      <w:proofErr w:type="spellStart"/>
+      <w:r>
+        <w:rPr>
+          <w:sz w:val="18"/>
+          <w:szCs w:val="18"/>
+        </w:rPr>
+        <w:t>of</w:t>
+      </w:r>
+      <w:proofErr w:type="spellEnd"/>
+      <w:r>
+        <w:rPr>
+          <w:sz w:val="18"/>
+          <w:szCs w:val="18"/>
+        </w:rPr>
+        <w:t xml:space="preserve"> </w:t>
+      </w:r>
+      <w:proofErr w:type="spellStart"/>
+      <w:r>
+        <w:rPr>
+          <w:sz w:val="18"/>
+          <w:szCs w:val="18"/>
+        </w:rPr>
+        <w:t>Ukraine</w:t>
+      </w:r>
+      <w:proofErr w:type="spellEnd"/>
+      <w:r>
+        <w:rPr>
+          <w:sz w:val="18"/>
+          <w:szCs w:val="18"/>
+        </w:rPr>
+        <w:t xml:space="preserve">, </w:t>
+      </w:r>
+      <w:proofErr w:type="spellStart"/>
+      <w:r>
+        <w:rPr>
+          <w:sz w:val="18"/>
+          <w:szCs w:val="18"/>
+        </w:rPr>
+        <w:t>Resolution</w:t>
+      </w:r>
+      <w:proofErr w:type="spellEnd"/>
+      <w:r>
+        <w:rPr>
+          <w:sz w:val="18"/>
+          <w:szCs w:val="18"/>
+        </w:rPr>
+        <w:t xml:space="preserve"> No. 541, 18 August 2015.</w:t>
       </w:r>
     </w:p>
   </w:footnote>
@@ -2375,7 +3425,119 @@
           <w:sz w:val="18"/>
           <w:szCs w:val="18"/>
         </w:rPr>
-        <w:t>Banque de France (2023), “Monetary policy in times of war: the case of Ukraine.”</w:t>
+        <w:t>Banque de France (2023), “</w:t>
+      </w:r>
+      <w:proofErr w:type="spellStart"/>
+      <w:r>
+        <w:rPr>
+          <w:sz w:val="18"/>
+          <w:szCs w:val="18"/>
+        </w:rPr>
+        <w:t>Monetary</w:t>
+      </w:r>
+      <w:proofErr w:type="spellEnd"/>
+      <w:r>
+        <w:rPr>
+          <w:sz w:val="18"/>
+          <w:szCs w:val="18"/>
+        </w:rPr>
+        <w:t xml:space="preserve"> </w:t>
+      </w:r>
+      <w:proofErr w:type="spellStart"/>
+      <w:r>
+        <w:rPr>
+          <w:sz w:val="18"/>
+          <w:szCs w:val="18"/>
+        </w:rPr>
+        <w:t>policy</w:t>
+      </w:r>
+      <w:proofErr w:type="spellEnd"/>
+      <w:r>
+        <w:rPr>
+          <w:sz w:val="18"/>
+          <w:szCs w:val="18"/>
+        </w:rPr>
+        <w:t xml:space="preserve"> in times </w:t>
+      </w:r>
+      <w:proofErr w:type="spellStart"/>
+      <w:r>
+        <w:rPr>
+          <w:sz w:val="18"/>
+          <w:szCs w:val="18"/>
+        </w:rPr>
+        <w:t>of</w:t>
+      </w:r>
+      <w:proofErr w:type="spellEnd"/>
+      <w:r>
+        <w:rPr>
+          <w:sz w:val="18"/>
+          <w:szCs w:val="18"/>
+        </w:rPr>
+        <w:t xml:space="preserve"> </w:t>
+      </w:r>
+      <w:proofErr w:type="spellStart"/>
+      <w:r>
+        <w:rPr>
+          <w:sz w:val="18"/>
+          <w:szCs w:val="18"/>
+        </w:rPr>
+        <w:t>war</w:t>
+      </w:r>
+      <w:proofErr w:type="spellEnd"/>
+      <w:r>
+        <w:rPr>
+          <w:sz w:val="18"/>
+          <w:szCs w:val="18"/>
+        </w:rPr>
+        <w:t xml:space="preserve">: </w:t>
+      </w:r>
+      <w:proofErr w:type="spellStart"/>
+      <w:r>
+        <w:rPr>
+          <w:sz w:val="18"/>
+          <w:szCs w:val="18"/>
+        </w:rPr>
+        <w:t>the</w:t>
+      </w:r>
+      <w:proofErr w:type="spellEnd"/>
+      <w:r>
+        <w:rPr>
+          <w:sz w:val="18"/>
+          <w:szCs w:val="18"/>
+        </w:rPr>
+        <w:t xml:space="preserve"> case </w:t>
+      </w:r>
+      <w:proofErr w:type="spellStart"/>
+      <w:r>
+        <w:rPr>
+          <w:sz w:val="18"/>
+          <w:szCs w:val="18"/>
+        </w:rPr>
+        <w:t>of</w:t>
+      </w:r>
+      <w:proofErr w:type="spellEnd"/>
+      <w:r>
+        <w:rPr>
+          <w:sz w:val="18"/>
+          <w:szCs w:val="18"/>
+        </w:rPr>
+        <w:t xml:space="preserve"> </w:t>
+      </w:r>
+      <w:proofErr w:type="spellStart"/>
+      <w:r>
+        <w:rPr>
+          <w:sz w:val="18"/>
+          <w:szCs w:val="18"/>
+        </w:rPr>
+        <w:t>Ukraine</w:t>
+      </w:r>
+      <w:proofErr w:type="spellEnd"/>
+      <w:r>
+        <w:rPr>
+          <w:sz w:val="18"/>
+          <w:szCs w:val="18"/>
+        </w:rPr>
+        <w:t>.”</w:t>
       </w:r>
     </w:p>
   </w:footnote>
@@ -2392,7 +3554,135 @@
           <w:sz w:val="18"/>
           <w:szCs w:val="18"/>
         </w:rPr>
-        <w:t>NBU, “Easing of FX Restrictions and Return to Floating Exchange Rate,” Strategy document (2024).</w:t>
+        <w:t>NBU, “</w:t>
+      </w:r>
+      <w:proofErr w:type="spellStart"/>
+      <w:r>
+        <w:rPr>
+          <w:sz w:val="18"/>
+          <w:szCs w:val="18"/>
+        </w:rPr>
+        <w:t>Easing</w:t>
+      </w:r>
+      <w:proofErr w:type="spellEnd"/>
+      <w:r>
+        <w:rPr>
+          <w:sz w:val="18"/>
+          <w:szCs w:val="18"/>
+        </w:rPr>
+        <w:t xml:space="preserve"> </w:t>
+      </w:r>
+      <w:proofErr w:type="spellStart"/>
+      <w:r>
+        <w:rPr>
+          <w:sz w:val="18"/>
+          <w:szCs w:val="18"/>
+        </w:rPr>
+        <w:t>of</w:t>
+      </w:r>
+      <w:proofErr w:type="spellEnd"/>
+      <w:r>
+        <w:rPr>
+          <w:sz w:val="18"/>
+          <w:szCs w:val="18"/>
+        </w:rPr>
+        <w:t xml:space="preserve"> FX </w:t>
+      </w:r>
+      <w:proofErr w:type="spellStart"/>
+      <w:r>
+        <w:rPr>
+          <w:sz w:val="18"/>
+          <w:szCs w:val="18"/>
+        </w:rPr>
+        <w:t>Restrictions</w:t>
+      </w:r>
+      <w:proofErr w:type="spellEnd"/>
+      <w:r>
+        <w:rPr>
+          <w:sz w:val="18"/>
+          <w:szCs w:val="18"/>
+        </w:rPr>
+        <w:t xml:space="preserve"> </w:t>
+      </w:r>
+      <w:proofErr w:type="spellStart"/>
+      <w:r>
+        <w:rPr>
+          <w:sz w:val="18"/>
+          <w:szCs w:val="18"/>
+        </w:rPr>
+        <w:t>and</w:t>
+      </w:r>
+      <w:proofErr w:type="spellEnd"/>
+      <w:r>
+        <w:rPr>
+          <w:sz w:val="18"/>
+          <w:szCs w:val="18"/>
+        </w:rPr>
+        <w:t xml:space="preserve"> </w:t>
+      </w:r>
+      <w:proofErr w:type="spellStart"/>
+      <w:r>
+        <w:rPr>
+          <w:sz w:val="18"/>
+          <w:szCs w:val="18"/>
+        </w:rPr>
+        <w:t>Return</w:t>
+      </w:r>
+      <w:proofErr w:type="spellEnd"/>
+      <w:r>
+        <w:rPr>
+          <w:sz w:val="18"/>
+          <w:szCs w:val="18"/>
+        </w:rPr>
+        <w:t xml:space="preserve"> </w:t>
+      </w:r>
+      <w:proofErr w:type="spellStart"/>
+      <w:r>
+        <w:rPr>
+          <w:sz w:val="18"/>
+          <w:szCs w:val="18"/>
+        </w:rPr>
+        <w:t>to</w:t>
+      </w:r>
+      <w:proofErr w:type="spellEnd"/>
+      <w:r>
+        <w:rPr>
+          <w:sz w:val="18"/>
+          <w:szCs w:val="18"/>
+        </w:rPr>
+        <w:t xml:space="preserve"> Floating Exchange Rate,” </w:t>
+      </w:r>
+      <w:proofErr w:type="spellStart"/>
+      <w:r>
+        <w:rPr>
+          <w:sz w:val="18"/>
+          <w:szCs w:val="18"/>
+        </w:rPr>
+        <w:t>Strategy</w:t>
+      </w:r>
+      <w:proofErr w:type="spellEnd"/>
+      <w:r>
+        <w:rPr>
+          <w:sz w:val="18"/>
+          <w:szCs w:val="18"/>
+        </w:rPr>
+        <w:t xml:space="preserve"> </w:t>
+      </w:r>
+      <w:proofErr w:type="spellStart"/>
+      <w:r>
+        <w:rPr>
+          <w:sz w:val="18"/>
+          <w:szCs w:val="18"/>
+        </w:rPr>
+        <w:t>document</w:t>
+      </w:r>
+      <w:proofErr w:type="spellEnd"/>
+      <w:r>
+        <w:rPr>
+          <w:sz w:val="18"/>
+          <w:szCs w:val="18"/>
+        </w:rPr>
+        <w:t xml:space="preserve"> (2024).</w:t>
       </w:r>
     </w:p>
   </w:footnote>
@@ -2416,8 +3706,54 @@
         <w:sz w:val="18"/>
         <w:szCs w:val="18"/>
       </w:rPr>
-      <w:t>Part A — Ukraine’s Monetary Regime Chronology</w:t>
+      <w:t xml:space="preserve">Part A — </w:t>
     </w:r>
+    <w:proofErr w:type="spellStart"/>
+    <w:r>
+      <w:rPr>
+        <w:color w:val="888888"/>
+        <w:sz w:val="18"/>
+        <w:szCs w:val="18"/>
+      </w:rPr>
+      <w:t>Ukraine’s</w:t>
+    </w:r>
+    <w:proofErr w:type="spellEnd"/>
+    <w:r>
+      <w:rPr>
+        <w:color w:val="888888"/>
+        <w:sz w:val="18"/>
+        <w:szCs w:val="18"/>
+      </w:rPr>
+      <w:t xml:space="preserve"> </w:t>
+    </w:r>
+    <w:proofErr w:type="spellStart"/>
+    <w:r>
+      <w:rPr>
+        <w:color w:val="888888"/>
+        <w:sz w:val="18"/>
+        <w:szCs w:val="18"/>
+      </w:rPr>
+      <w:t>Monetary</w:t>
+    </w:r>
+    <w:proofErr w:type="spellEnd"/>
+    <w:r>
+      <w:rPr>
+        <w:color w:val="888888"/>
+        <w:sz w:val="18"/>
+        <w:szCs w:val="18"/>
+      </w:rPr>
+      <w:t xml:space="preserve"> Regime </w:t>
+    </w:r>
+    <w:proofErr w:type="spellStart"/>
+    <w:r>
+      <w:rPr>
+        <w:color w:val="888888"/>
+        <w:sz w:val="18"/>
+        <w:szCs w:val="18"/>
+      </w:rPr>
+      <w:t>Chronology</w:t>
+    </w:r>
+    <w:proofErr w:type="spellEnd"/>
     <w:r>
       <w:rPr>
         <w:color w:val="888888"/>
@@ -2425,8 +3761,71 @@
         <w:szCs w:val="18"/>
       </w:rPr>
       <w:tab/>
-      <w:t>Quantitative Methods in Finance — Final Exam 2025–2026</w:t>
     </w:r>
+    <w:proofErr w:type="spellStart"/>
+    <w:r>
+      <w:rPr>
+        <w:color w:val="888888"/>
+        <w:sz w:val="18"/>
+        <w:szCs w:val="18"/>
+      </w:rPr>
+      <w:t>Quantitative</w:t>
+    </w:r>
+    <w:proofErr w:type="spellEnd"/>
+    <w:r>
+      <w:rPr>
+        <w:color w:val="888888"/>
+        <w:sz w:val="18"/>
+        <w:szCs w:val="18"/>
+      </w:rPr>
+      <w:t xml:space="preserve"> </w:t>
+    </w:r>
+    <w:proofErr w:type="spellStart"/>
+    <w:r>
+      <w:rPr>
+        <w:color w:val="888888"/>
+        <w:sz w:val="18"/>
+        <w:szCs w:val="18"/>
+      </w:rPr>
+      <w:t>Methods</w:t>
+    </w:r>
+    <w:proofErr w:type="spellEnd"/>
+    <w:r>
+      <w:rPr>
+        <w:color w:val="888888"/>
+        <w:sz w:val="18"/>
+        <w:szCs w:val="18"/>
+      </w:rPr>
+      <w:t xml:space="preserve"> in </w:t>
+    </w:r>
+    <w:proofErr w:type="spellStart"/>
+    <w:r>
+      <w:rPr>
+        <w:color w:val="888888"/>
+        <w:sz w:val="18"/>
+        <w:szCs w:val="18"/>
+      </w:rPr>
+      <w:t>Finance</w:t>
+    </w:r>
+    <w:proofErr w:type="spellEnd"/>
+    <w:r>
+      <w:rPr>
+        <w:color w:val="888888"/>
+        <w:sz w:val="18"/>
+        <w:szCs w:val="18"/>
+      </w:rPr>
+      <w:t xml:space="preserve"> — Final </w:t>
+    </w:r>
+    <w:proofErr w:type="spellStart"/>
+    <w:r>
+      <w:rPr>
+        <w:color w:val="888888"/>
+        <w:sz w:val="18"/>
+        <w:szCs w:val="18"/>
+      </w:rPr>
+      <w:t>Exam</w:t>
+    </w:r>
+    <w:proofErr w:type="spellEnd"/>
   </w:p>
 </w:hdr>
 </file>
@@ -3131,6 +4530,48 @@
       <w:szCs w:val="20"/>
     </w:rPr>
   </w:style>
+  <w:style w:type="paragraph" w:styleId="Cabealho">
+    <w:name w:val="header"/>
+    <w:basedOn w:val="Normal"/>
+    <w:link w:val="CabealhoChar"/>
+    <w:uiPriority w:val="99"/>
+    <w:unhideWhenUsed/>
+    <w:rsid w:val="007D70CF"/>
+    <w:pPr>
+      <w:tabs>
+        <w:tab w:val="center" w:pos="4252"/>
+        <w:tab w:val="right" w:pos="8504"/>
+      </w:tabs>
+    </w:pPr>
+  </w:style>
+  <w:style w:type="character" w:customStyle="1" w:styleId="CabealhoChar">
+    <w:name w:val="Cabeçalho Char"/>
+    <w:basedOn w:val="Fontepargpadro"/>
+    <w:link w:val="Cabealho"/>
+    <w:uiPriority w:val="99"/>
+    <w:rsid w:val="007D70CF"/>
+  </w:style>
+  <w:style w:type="paragraph" w:styleId="Rodap">
+    <w:name w:val="footer"/>
+    <w:basedOn w:val="Normal"/>
+    <w:link w:val="RodapChar"/>
+    <w:uiPriority w:val="99"/>
+    <w:unhideWhenUsed/>
+    <w:rsid w:val="007D70CF"/>
+    <w:pPr>
+      <w:tabs>
+        <w:tab w:val="center" w:pos="4252"/>
+        <w:tab w:val="right" w:pos="8504"/>
+      </w:tabs>
+    </w:pPr>
+  </w:style>
+  <w:style w:type="character" w:customStyle="1" w:styleId="RodapChar">
+    <w:name w:val="Rodapé Char"/>
+    <w:basedOn w:val="Fontepargpadro"/>
+    <w:link w:val="Rodap"/>
+    <w:uiPriority w:val="99"/>
+    <w:rsid w:val="007D70CF"/>
+  </w:style>
 </w:styles>
 </file>
 

</xml_diff>